<commit_message>
revised in response to two peer reviews
</commit_message>
<xml_diff>
--- a/paper/paper.docx
+++ b/paper/paper.docx
@@ -36,7 +36,7 @@
         <w:pStyle w:val="Date"/>
       </w:pPr>
       <w:r>
-        <w:t xml:space="preserve">2026-08-08</w:t>
+        <w:t xml:space="preserve">2026-08-26</w:t>
       </w:r>
     </w:p>
     <w:p>
@@ -52,127 +52,137 @@
         <w:pStyle w:val="Abstract"/>
       </w:pPr>
       <w:r>
-        <w:t xml:space="preserve">A landmark 29 June 2023 U.S. Supreme Court decision (</w:t>
+        <w:t xml:space="preserve">A landmark June 2023 U.S. Supreme Court decision (</w:t>
       </w:r>
       <w:r>
         <w:rPr>
           <w:i/>
           <w:iCs/>
         </w:rPr>
-        <w:t xml:space="preserve">SFFA v.</w:t>
-      </w:r>
-      <w:r>
-        <w:rPr>
-          <w:i/>
-          <w:iCs/>
-        </w:rPr>
-        <w:t xml:space="preserve"> </w:t>
-      </w:r>
-      <w:r>
-        <w:rPr>
-          <w:i/>
-          <w:iCs/>
-        </w:rPr>
-        <w:t xml:space="preserve">Harvard</w:t>
-      </w:r>
-      <w:r>
-        <w:t xml:space="preserve">) held that race-based admissions at colleges and universities</w:t>
-      </w:r>
-      <w:r>
-        <w:t xml:space="preserve"> </w:t>
-      </w:r>
-      <w:r>
-        <w:t xml:space="preserve">were unconstitutional. During the case, elite schools made predictions</w:t>
-      </w:r>
-      <w:r>
-        <w:t xml:space="preserve"> </w:t>
-      </w:r>
-      <w:r>
-        <w:t xml:space="preserve">about what would happen if SFFA were to win (as it went on to do).</w:t>
-      </w:r>
-      <w:r>
-        <w:t xml:space="preserve"> </w:t>
-      </w:r>
-      <w:r>
-        <w:t xml:space="preserve">Thirty-three selective schools predicted Black enrollment declines of</w:t>
-      </w:r>
-      <w:r>
-        <w:t xml:space="preserve"> </w:t>
-      </w:r>
-      <w:r>
-        <w:t xml:space="preserve">50 to 70 percent. Harvard’s expert witness, David Card, estimated that</w:t>
-      </w:r>
-      <w:r>
-        <w:t xml:space="preserve"> </w:t>
-      </w:r>
-      <w:r>
-        <w:t xml:space="preserve">eliminating racial preferences would cut the Black share of Harvard’s</w:t>
-      </w:r>
-      <w:r>
-        <w:t xml:space="preserve"> </w:t>
-      </w:r>
-      <w:r>
-        <w:t xml:space="preserve">admitted class from 14 percent to 6 percent. Years have passed since</w:t>
-      </w:r>
-      <w:r>
-        <w:t xml:space="preserve"> </w:t>
-      </w:r>
-      <w:r>
-        <w:t xml:space="preserve">the 2023 Supreme Court decision. Here, I test the predictions using</w:t>
-      </w:r>
-      <w:r>
-        <w:t xml:space="preserve"> </w:t>
-      </w:r>
-      <w:r>
-        <w:t xml:space="preserve">Common Data Set and IPEDS records assembled for sixty-three selective</w:t>
-      </w:r>
-      <w:r>
-        <w:t xml:space="preserve"> </w:t>
-      </w:r>
-      <w:r>
-        <w:t xml:space="preserve">institutions through fall 2025. Once the incompatible definitions of</w:t>
-      </w:r>
-      <w:r>
-        <w:t xml:space="preserve"> </w:t>
-      </w:r>
-      <w:r>
-        <w:t xml:space="preserve">population and race underlying the litigation figures are reconciled,</w:t>
-      </w:r>
-      <w:r>
-        <w:t xml:space="preserve"> </w:t>
-      </w:r>
-      <w:r>
-        <w:t xml:space="preserve">I find that: (1) Average Black enrollment among the 33 colleges</w:t>
-      </w:r>
-      <w:r>
-        <w:t xml:space="preserve"> </w:t>
-      </w:r>
-      <w:r>
-        <w:t xml:space="preserve">exceeds its pre-litigation benchmark. (2) Black enrollment at the</w:t>
-      </w:r>
-      <w:r>
-        <w:t xml:space="preserve"> </w:t>
-      </w:r>
-      <w:r>
-        <w:t xml:space="preserve">research universities is essentially unchanged. (3) Harvard’s Black</w:t>
-      </w:r>
-      <w:r>
-        <w:t xml:space="preserve"> </w:t>
-      </w:r>
-      <w:r>
-        <w:t xml:space="preserve">enrollment matches its 2010-2015 level. The results raise the issue:</w:t>
-      </w:r>
-      <w:r>
-        <w:t xml:space="preserve"> </w:t>
-      </w:r>
-      <w:r>
-        <w:t xml:space="preserve">Does abiding by the decision not have the predicted effect, or are the</w:t>
-      </w:r>
-      <w:r>
-        <w:t xml:space="preserve"> </w:t>
-      </w:r>
-      <w:r>
-        <w:t xml:space="preserve">schools not abiding by the decision?</w:t>
+        <w:t xml:space="preserve">SFFA v. Harvard</w:t>
+      </w:r>
+      <w:r>
+        <w:t xml:space="preserve">)</w:t>
+      </w:r>
+      <w:r>
+        <w:t xml:space="preserve"> </w:t>
+      </w:r>
+      <w:r>
+        <w:t xml:space="preserve">held that race-based admissions at colleges and universities are</w:t>
+      </w:r>
+      <w:r>
+        <w:t xml:space="preserve"> </w:t>
+      </w:r>
+      <w:r>
+        <w:t xml:space="preserve">unconstitutional. During the litigation, elite schools predicted what</w:t>
+      </w:r>
+      <w:r>
+        <w:t xml:space="preserve"> </w:t>
+      </w:r>
+      <w:r>
+        <w:t xml:space="preserve">would happen if SFFA were to win, as it went on to do. Thirty-three</w:t>
+      </w:r>
+      <w:r>
+        <w:t xml:space="preserve"> </w:t>
+      </w:r>
+      <w:r>
+        <w:t xml:space="preserve">selective colleges forecast Black enrollment declines of 50 to 70</w:t>
+      </w:r>
+      <w:r>
+        <w:t xml:space="preserve"> </w:t>
+      </w:r>
+      <w:r>
+        <w:t xml:space="preserve">percent. Fifteen research universities assured the Court that</w:t>
+      </w:r>
+      <w:r>
+        <w:t xml:space="preserve"> </w:t>
+      </w:r>
+      <w:r>
+        <w:t xml:space="preserve">race-neutral admissions</w:t>
+      </w:r>
+      <w:r>
+        <w:t xml:space="preserve"> </w:t>
+      </w:r>
+      <w:r>
+        <w:t xml:space="preserve">“would undercut”</w:t>
+      </w:r>
+      <w:r>
+        <w:t xml:space="preserve"> </w:t>
+      </w:r>
+      <w:r>
+        <w:t xml:space="preserve">the diversity they seek.</w:t>
+      </w:r>
+      <w:r>
+        <w:t xml:space="preserve"> </w:t>
+      </w:r>
+      <w:r>
+        <w:t xml:space="preserve">Harvard’s expert witness, David Card, estimated that eliminating racial</w:t>
+      </w:r>
+      <w:r>
+        <w:t xml:space="preserve"> </w:t>
+      </w:r>
+      <w:r>
+        <w:t xml:space="preserve">preferences would cut the Black share of Harvard’s admitted class from</w:t>
+      </w:r>
+      <w:r>
+        <w:t xml:space="preserve"> </w:t>
+      </w:r>
+      <w:r>
+        <w:t xml:space="preserve">14 percent to 6 percent. I test these predictions using Common Data Set</w:t>
+      </w:r>
+      <w:r>
+        <w:t xml:space="preserve"> </w:t>
+      </w:r>
+      <w:r>
+        <w:t xml:space="preserve">and IPEDS records for sixty-three selective institutions through fall</w:t>
+      </w:r>
+      <w:r>
+        <w:t xml:space="preserve"> </w:t>
+      </w:r>
+      <w:r>
+        <w:t xml:space="preserve">2025. Relative to the 2010-2015 litigation-era baseline, the average</w:t>
+      </w:r>
+      <w:r>
+        <w:t xml:space="preserve"> </w:t>
+      </w:r>
+      <w:r>
+        <w:t xml:space="preserve">Black share of the entering class is steady or slightly higher, and</w:t>
+      </w:r>
+      <w:r>
+        <w:t xml:space="preserve"> </w:t>
+      </w:r>
+      <w:r>
+        <w:t xml:space="preserve">Harvard sits at its pre-ruling level. Because that share rose after the</w:t>
+      </w:r>
+      <w:r>
+        <w:t xml:space="preserve"> </w:t>
+      </w:r>
+      <w:r>
+        <w:t xml:space="preserve">events of 2020, the post-ruling classes do sit below the 2020-2023</w:t>
+      </w:r>
+      <w:r>
+        <w:t xml:space="preserve"> </w:t>
+      </w:r>
+      <w:r>
+        <w:t xml:space="preserve">levels, by roughly a tenth at the thirty-three colleges and a fifth at</w:t>
+      </w:r>
+      <w:r>
+        <w:t xml:space="preserve"> </w:t>
+      </w:r>
+      <w:r>
+        <w:t xml:space="preserve">the fifteen universities, but far short of the forecast declines. The</w:t>
+      </w:r>
+      <w:r>
+        <w:t xml:space="preserve"> </w:t>
+      </w:r>
+      <w:r>
+        <w:t xml:space="preserve">results raise the issue: Does following the Court’s ruling not have the</w:t>
+      </w:r>
+      <w:r>
+        <w:t xml:space="preserve"> </w:t>
+      </w:r>
+      <w:r>
+        <w:t xml:space="preserve">predicted effect, or are the schools not abiding by the decision?</w:t>
       </w:r>
     </w:p>
     <w:p>
@@ -262,13 +272,37 @@
         <w:t xml:space="preserve"> </w:t>
       </w:r>
       <w:r>
-        <w:t xml:space="preserve">(Amherst Brief 2022, 13-14). Harvard expert David Card simulated race-blind</w:t>
-      </w:r>
-      <w:r>
-        <w:t xml:space="preserve"> </w:t>
-      </w:r>
-      <w:r>
-        <w:t xml:space="preserve">admission for the Class of 2019 and reported that the Black</w:t>
+        <w:t xml:space="preserve">(Amherst Brief 2022, 13-14). Fifteen research universities assured the</w:t>
+      </w:r>
+      <w:r>
+        <w:t xml:space="preserve"> </w:t>
+      </w:r>
+      <w:r>
+        <w:t xml:space="preserve">Court that race-neutral admissions</w:t>
+      </w:r>
+      <w:r>
+        <w:t xml:space="preserve"> </w:t>
+      </w:r>
+      <w:r>
+        <w:t xml:space="preserve">“would undercut”</w:t>
+      </w:r>
+      <w:r>
+        <w:t xml:space="preserve"> </w:t>
+      </w:r>
+      <w:r>
+        <w:t xml:space="preserve">the diversity they</w:t>
+      </w:r>
+      <w:r>
+        <w:t xml:space="preserve"> </w:t>
+      </w:r>
+      <w:r>
+        <w:t xml:space="preserve">seek (Universities Brief 2022, 25). Harvard expert David Card simulated</w:t>
+      </w:r>
+      <w:r>
+        <w:t xml:space="preserve"> </w:t>
+      </w:r>
+      <w:r>
+        <w:t xml:space="preserve">race-blind admission for the Class of 2019 and reported that the Black</w:t>
       </w:r>
       <w:r>
         <w:t xml:space="preserve"> </w:t>
@@ -288,31 +322,25 @@
         <w:pStyle w:val="BodyText"/>
       </w:pPr>
       <w:r>
-        <w:t xml:space="preserve">Enrollment records for the first two</w:t>
-      </w:r>
-      <w:r>
-        <w:t xml:space="preserve"> </w:t>
-      </w:r>
-      <w:r>
-        <w:t xml:space="preserve">admissions cycles conducted under the new legal regime, the entering</w:t>
-      </w:r>
-      <w:r>
-        <w:t xml:space="preserve"> </w:t>
-      </w:r>
-      <w:r>
-        <w:t xml:space="preserve">classes of fall 2024 and fall 2025, are now available. These forecasts can</w:t>
-      </w:r>
-      <w:r>
-        <w:t xml:space="preserve"> </w:t>
-      </w:r>
-      <w:r>
-        <w:t xml:space="preserve">therefore be evaluated against realized outcomes, a test that, to my</w:t>
-      </w:r>
-      <w:r>
-        <w:t xml:space="preserve"> </w:t>
-      </w:r>
-      <w:r>
-        <w:t xml:space="preserve">knowledge, no published study has yet performed.</w:t>
+        <w:t xml:space="preserve">Enrollment records for the first two admissions cycles conducted</w:t>
+      </w:r>
+      <w:r>
+        <w:t xml:space="preserve"> </w:t>
+      </w:r>
+      <w:r>
+        <w:t xml:space="preserve">under the new legal regime, the entering classes of fall 2024 and</w:t>
+      </w:r>
+      <w:r>
+        <w:t xml:space="preserve"> </w:t>
+      </w:r>
+      <w:r>
+        <w:t xml:space="preserve">fall 2025, are now available, and the forecasts can therefore be</w:t>
+      </w:r>
+      <w:r>
+        <w:t xml:space="preserve"> </w:t>
+      </w:r>
+      <w:r>
+        <w:t xml:space="preserve">evaluated against realized outcomes.</w:t>
       </w:r>
     </w:p>
     <w:p>
@@ -356,37 +384,61 @@
         <w:t xml:space="preserve"> </w:t>
       </w:r>
       <w:r>
-        <w:t xml:space="preserve">coding, which assigns multiracial applicants to single categories). The</w:t>
-      </w:r>
-      <w:r>
-        <w:t xml:space="preserve"> </w:t>
-      </w:r>
-      <w:r>
-        <w:t xml:space="preserve">same student body therefore carries two Black shares that differ by</w:t>
-      </w:r>
-      <w:r>
-        <w:t xml:space="preserve"> </w:t>
-      </w:r>
-      <w:r>
-        <w:t xml:space="preserve">roughly a factor of two depending on which convention is applied. Once the expert-report metric and the federal metric</w:t>
-      </w:r>
-      <w:r>
-        <w:t xml:space="preserve"> </w:t>
-      </w:r>
-      <w:r>
-        <w:t xml:space="preserve">are placed on a common basis, Harvard’s post-ruling classes are</w:t>
-      </w:r>
-      <w:r>
-        <w:t xml:space="preserve"> </w:t>
-      </w:r>
-      <w:r>
-        <w:t xml:space="preserve">indistinguishable from the classes it enrolled while</w:t>
-      </w:r>
-      <w:r>
-        <w:t xml:space="preserve"> </w:t>
-      </w:r>
-      <w:r>
-        <w:t xml:space="preserve">practicing the admissions system it had prior to the decision.</w:t>
+        <w:t xml:space="preserve">coding, which assigns multiracial applicants to single categories).</w:t>
+      </w:r>
+      <w:r>
+        <w:t xml:space="preserve"> </w:t>
+      </w:r>
+      <w:r>
+        <w:t xml:space="preserve">The two conventions, applied to the same cohort, produce</w:t>
+      </w:r>
+      <w:r>
+        <w:t xml:space="preserve"> </w:t>
+      </w:r>
+      <w:r>
+        <w:t xml:space="preserve">Black shares that differ by roughly a factor of two. Comparing</w:t>
+      </w:r>
+      <w:r>
+        <w:t xml:space="preserve"> </w:t>
+      </w:r>
+      <w:r>
+        <w:t xml:space="preserve">Harvard’s post-ruling filings with its pre-ruling filings requires</w:t>
+      </w:r>
+      <w:r>
+        <w:t xml:space="preserve"> </w:t>
+      </w:r>
+      <w:r>
+        <w:t xml:space="preserve">no conversion, and that comparison shows entering classes</w:t>
+      </w:r>
+      <w:r>
+        <w:t xml:space="preserve"> </w:t>
+      </w:r>
+      <w:r>
+        <w:t xml:space="preserve">indistinguishable from the litigation-era classes Harvard enrolled</w:t>
+      </w:r>
+      <w:r>
+        <w:t xml:space="preserve"> </w:t>
+      </w:r>
+      <w:r>
+        <w:t xml:space="preserve">while practicing the admissions system it defended at trial. Conversion is required only</w:t>
+      </w:r>
+      <w:r>
+        <w:t xml:space="preserve"> </w:t>
+      </w:r>
+      <w:r>
+        <w:t xml:space="preserve">to test a filing against the race-blind share in Card’s simulation,</w:t>
+      </w:r>
+      <w:r>
+        <w:t xml:space="preserve"> </w:t>
+      </w:r>
+      <w:r>
+        <w:t xml:space="preserve">and once it is applied, the post-ruling filings sit at roughly</w:t>
+      </w:r>
+      <w:r>
+        <w:t xml:space="preserve"> </w:t>
+      </w:r>
+      <w:r>
+        <w:t xml:space="preserve">twice his race-blind benchmark.</w:t>
       </w:r>
     </w:p>
     <w:p>
@@ -400,13 +452,13 @@
         <w:t xml:space="preserve"> </w:t>
       </w:r>
       <w:r>
-        <w:t xml:space="preserve">classes whose racial composition is essentially</w:t>
-      </w:r>
-      <w:r>
-        <w:t xml:space="preserve"> </w:t>
-      </w:r>
-      <w:r>
-        <w:t xml:space="preserve">unchanged by</w:t>
+        <w:t xml:space="preserve">classes whose racial composition, measured against the</w:t>
+      </w:r>
+      <w:r>
+        <w:t xml:space="preserve"> </w:t>
+      </w:r>
+      <w:r>
+        <w:t xml:space="preserve">litigation-era baseline, is essentially unchanged by</w:t>
       </w:r>
       <w:r>
         <w:t xml:space="preserve"> </w:t>
@@ -419,13 +471,19 @@
         <w:t xml:space="preserve">SFFA</w:t>
       </w:r>
       <w:r>
-        <w:t xml:space="preserve">, a stability their own litigation forecasts said</w:t>
-      </w:r>
-      <w:r>
-        <w:t xml:space="preserve"> </w:t>
-      </w:r>
-      <w:r>
-        <w:t xml:space="preserve">race-neutral admissions could not produce. I support this conclusion</w:t>
+        <w:t xml:space="preserve">, a</w:t>
+      </w:r>
+      <w:r>
+        <w:t xml:space="preserve"> </w:t>
+      </w:r>
+      <w:r>
+        <w:t xml:space="preserve">stability their own litigation forecasts said race-neutral</w:t>
+      </w:r>
+      <w:r>
+        <w:t xml:space="preserve"> </w:t>
+      </w:r>
+      <w:r>
+        <w:t xml:space="preserve">admissions could not produce. I support this conclusion</w:t>
       </w:r>
       <w:r>
         <w:t xml:space="preserve"> </w:t>
@@ -442,13 +500,19 @@
         </w:numPr>
       </w:pPr>
       <w:r>
-        <w:t xml:space="preserve">Mean Black enrollment across the 33 amici colleges is above,</w:t>
-      </w:r>
-      <w:r>
-        <w:t xml:space="preserve"> </w:t>
-      </w:r>
-      <w:r>
-        <w:t xml:space="preserve">not below, its pre-litigation benchmark.</w:t>
+        <w:t xml:space="preserve">Mean Black enrollment across the 33 amici colleges is above, not</w:t>
+      </w:r>
+      <w:r>
+        <w:t xml:space="preserve"> </w:t>
+      </w:r>
+      <w:r>
+        <w:t xml:space="preserve">below, the fall 2010-2015 baseline, and about ten percent below</w:t>
+      </w:r>
+      <w:r>
+        <w:t xml:space="preserve"> </w:t>
+      </w:r>
+      <w:r>
+        <w:t xml:space="preserve">the elevated classes of 2020 through 2023.</w:t>
       </w:r>
     </w:p>
     <w:p>
@@ -459,25 +523,37 @@
         </w:numPr>
       </w:pPr>
       <w:r>
-        <w:t xml:space="preserve">Mean Black enrollment at the 15 research universities that told the</w:t>
-      </w:r>
-      <w:r>
-        <w:t xml:space="preserve"> </w:t>
-      </w:r>
-      <w:r>
-        <w:t xml:space="preserve">Court race-neutral admissions would undercut their diversity moved from</w:t>
-      </w:r>
-      <w:r>
-        <w:t xml:space="preserve"> </w:t>
-      </w:r>
-      <w:r>
-        <w:t xml:space="preserve">7.4 to 7.2 percent of US first-years, and six of the fifteen enroll</w:t>
-      </w:r>
-      <w:r>
-        <w:t xml:space="preserve"> </w:t>
-      </w:r>
-      <w:r>
-        <w:t xml:space="preserve">more Black students, relative to class size, than before.</w:t>
+        <w:t xml:space="preserve">Mean Black enrollment at the 15 research universities that told</w:t>
+      </w:r>
+      <w:r>
+        <w:t xml:space="preserve"> </w:t>
+      </w:r>
+      <w:r>
+        <w:t xml:space="preserve">the Court race-neutral admissions would undercut their diversity</w:t>
+      </w:r>
+      <w:r>
+        <w:t xml:space="preserve"> </w:t>
+      </w:r>
+      <w:r>
+        <w:t xml:space="preserve">moved from 7.4 percent of US first-years in fall 2010-2015 to 7.2</w:t>
+      </w:r>
+      <w:r>
+        <w:t xml:space="preserve"> </w:t>
+      </w:r>
+      <w:r>
+        <w:t xml:space="preserve">percent, roughly a fifth below the level of the 2020 through 2023</w:t>
+      </w:r>
+      <w:r>
+        <w:t xml:space="preserve"> </w:t>
+      </w:r>
+      <w:r>
+        <w:t xml:space="preserve">classes, and six of the fifteen enroll more Black students,</w:t>
+      </w:r>
+      <w:r>
+        <w:t xml:space="preserve"> </w:t>
+      </w:r>
+      <w:r>
+        <w:t xml:space="preserve">relative to class size, than in the 2010-2015 window.</w:t>
       </w:r>
     </w:p>
     <w:p>
@@ -488,25 +564,31 @@
         </w:numPr>
       </w:pPr>
       <w:r>
-        <w:t xml:space="preserve">The ratio of Asian to Black first-year students across</w:t>
-      </w:r>
-      <w:r>
-        <w:t xml:space="preserve"> </w:t>
-      </w:r>
-      <w:r>
-        <w:t xml:space="preserve">the 47 top-ranked institutions has moved a small fraction of the</w:t>
-      </w:r>
-      <w:r>
-        <w:t xml:space="preserve"> </w:t>
-      </w:r>
-      <w:r>
-        <w:t xml:space="preserve">distance toward the levels observed at universities bound by California’s</w:t>
-      </w:r>
-      <w:r>
-        <w:t xml:space="preserve"> </w:t>
-      </w:r>
-      <w:r>
-        <w:t xml:space="preserve">Proposition 209, the closest available approximation to a race-blind benchmark.</w:t>
+        <w:t xml:space="preserve">The ratio of Asian to Black first-year students across the 47</w:t>
+      </w:r>
+      <w:r>
+        <w:t xml:space="preserve"> </w:t>
+      </w:r>
+      <w:r>
+        <w:t xml:space="preserve">top-ranked institutions has moved, since the eve of the ruling, a</w:t>
+      </w:r>
+      <w:r>
+        <w:t xml:space="preserve"> </w:t>
+      </w:r>
+      <w:r>
+        <w:t xml:space="preserve">small fraction of the distance toward the levels observed at</w:t>
+      </w:r>
+      <w:r>
+        <w:t xml:space="preserve"> </w:t>
+      </w:r>
+      <w:r>
+        <w:t xml:space="preserve">universities bound by California’s Proposition 209, the closest</w:t>
+      </w:r>
+      <w:r>
+        <w:t xml:space="preserve"> </w:t>
+      </w:r>
+      <w:r>
+        <w:t xml:space="preserve">available approximation to a race-blind benchmark.</w:t>
       </w:r>
     </w:p>
     <w:p>
@@ -517,13 +599,7 @@
         </w:numPr>
       </w:pPr>
       <w:r>
-        <w:t xml:space="preserve">Black enrollment at Harvard, correctly converted, sits at its 2010-2015</w:t>
-      </w:r>
-      <w:r>
-        <w:t xml:space="preserve"> </w:t>
-      </w:r>
-      <w:r>
-        <w:t xml:space="preserve">level.</w:t>
+        <w:t xml:space="preserve">Black enrollment at Harvard sits at its 2010-2015 level.</w:t>
       </w:r>
     </w:p>
     <w:p>
@@ -531,13 +607,55 @@
         <w:pStyle w:val="FirstParagraph"/>
       </w:pPr>
       <w:r>
-        <w:t xml:space="preserve">These results raise the issue: Does abiding by the decision not have</w:t>
-      </w:r>
-      <w:r>
-        <w:t xml:space="preserve"> </w:t>
-      </w:r>
-      <w:r>
-        <w:t xml:space="preserve">the predicted effect, or are the schools not abiding by the decision?</w:t>
+        <w:t xml:space="preserve">These comparisons, except where stated, use the entering classes of</w:t>
+      </w:r>
+      <w:r>
+        <w:t xml:space="preserve"> </w:t>
+      </w:r>
+      <w:r>
+        <w:t xml:space="preserve">fall 2010 through 2015 as the baseline because the litigation did.</w:t>
+      </w:r>
+      <w:r>
+        <w:t xml:space="preserve"> </w:t>
+      </w:r>
+      <w:r>
+        <w:t xml:space="preserve">Card’s models were estimated on those cohorts. Comparisons against</w:t>
+      </w:r>
+      <w:r>
+        <w:t xml:space="preserve"> </w:t>
+      </w:r>
+      <w:r>
+        <w:t xml:space="preserve">both baselines, the</w:t>
+      </w:r>
+      <w:r>
+        <w:t xml:space="preserve"> </w:t>
+      </w:r>
+      <w:r>
+        <w:t xml:space="preserve">litigation window and the elevated classes of 2020 through 2023,</w:t>
+      </w:r>
+      <w:r>
+        <w:t xml:space="preserve"> </w:t>
+      </w:r>
+      <w:r>
+        <w:t xml:space="preserve">appear throughout the paper, and at the group level neither</w:t>
+      </w:r>
+      <w:r>
+        <w:t xml:space="preserve"> </w:t>
+      </w:r>
+      <w:r>
+        <w:t xml:space="preserve">approaches the forecast declines of 50 to 70 percent. These results</w:t>
+      </w:r>
+      <w:r>
+        <w:t xml:space="preserve"> </w:t>
+      </w:r>
+      <w:r>
+        <w:t xml:space="preserve">raise the issue: Does abiding by the decision not have the predicted</w:t>
+      </w:r>
+      <w:r>
+        <w:t xml:space="preserve"> </w:t>
+      </w:r>
+      <w:r>
+        <w:t xml:space="preserve">effect, or are the schools not abiding by the decision?</w:t>
       </w:r>
     </w:p>
     <w:p>
@@ -545,103 +663,67 @@
         <w:pStyle w:val="BodyText"/>
       </w:pPr>
       <w:r>
-        <w:t xml:space="preserve">The paper also raises concerns about the role of economic expertise. Card’s</w:t>
-      </w:r>
-      <w:r>
-        <w:t xml:space="preserve"> </w:t>
-      </w:r>
-      <w:r>
-        <w:t xml:space="preserve">report was produced for litigation and stated its predictions in units</w:t>
-      </w:r>
-      <w:r>
-        <w:t xml:space="preserve"> </w:t>
-      </w:r>
-      <w:r>
-        <w:t xml:space="preserve">that correspond to no publicly reported statistic. The analyses on the</w:t>
-      </w:r>
-      <w:r>
-        <w:t xml:space="preserve"> </w:t>
-      </w:r>
-      <w:r>
-        <w:t xml:space="preserve">plaintiff’s side did enter scholarly journals (Arcidiacono, Kinsler, and</w:t>
-      </w:r>
-      <w:r>
-        <w:t xml:space="preserve"> </w:t>
-      </w:r>
-      <w:r>
-        <w:t xml:space="preserve">Ransom 2022a, 2022b), but the defense simulation by Card that became the</w:t>
-      </w:r>
-      <w:r>
-        <w:t xml:space="preserve"> </w:t>
-      </w:r>
-      <w:r>
-        <w:t xml:space="preserve">public reference point did not, and no mapping between its conventions</w:t>
-      </w:r>
-      <w:r>
-        <w:t xml:space="preserve"> </w:t>
-      </w:r>
-      <w:r>
-        <w:t xml:space="preserve">and the CDS categories has previously been published. Sixteen prominent</w:t>
-      </w:r>
-      <w:r>
-        <w:t xml:space="preserve"> </w:t>
-      </w:r>
-      <w:r>
-        <w:t xml:space="preserve">economists—George A. Akerlof, Sandy Baum, Rebecca M. Blank, Hilary</w:t>
-      </w:r>
-      <w:r>
-        <w:t xml:space="preserve"> </w:t>
-      </w:r>
-      <w:r>
-        <w:t xml:space="preserve">Hoynes, Guido W. Imbens, Kirabo Jackson, Rucker Johnson, Helen F. Ladd,</w:t>
-      </w:r>
-      <w:r>
-        <w:t xml:space="preserve"> </w:t>
-      </w:r>
-      <w:r>
-        <w:t xml:space="preserve">David S. Lee, Trevon D. Logan, Michael McPherson, Jesse Rothstein,</w:t>
-      </w:r>
-      <w:r>
-        <w:t xml:space="preserve"> </w:t>
-      </w:r>
-      <w:r>
-        <w:t xml:space="preserve">Robert M. Solow, Sarah Turner, Ebonya Washington, and Douglas</w:t>
-      </w:r>
-      <w:r>
-        <w:t xml:space="preserve"> </w:t>
-      </w:r>
-      <w:r>
-        <w:t xml:space="preserve">Webber—three of them Nobel laureates, nonetheless attested to the Court</w:t>
-      </w:r>
-      <w:r>
-        <w:t xml:space="preserve"> </w:t>
-      </w:r>
-      <w:r>
-        <w:t xml:space="preserve">that the analysis was methodologically sound (Economics Professors Brief</w:t>
-      </w:r>
-      <w:r>
-        <w:t xml:space="preserve"> </w:t>
-      </w:r>
-      <w:r>
-        <w:t xml:space="preserve">2022). The most widely cited prediction in the case is one that the</w:t>
-      </w:r>
-      <w:r>
-        <w:t xml:space="preserve"> </w:t>
-      </w:r>
-      <w:r>
-        <w:t xml:space="preserve">public record cannot check. Institutions with an interest in appearing</w:t>
-      </w:r>
-      <w:r>
-        <w:t xml:space="preserve"> </w:t>
-      </w:r>
-      <w:r>
-        <w:t xml:space="preserve">compliant benefit from the resulting ambiguity. Harvard’s own use of</w:t>
-      </w:r>
-      <w:r>
-        <w:t xml:space="preserve"> </w:t>
-      </w:r>
-      <w:r>
-        <w:t xml:space="preserve">this ambiguity in its post-ruling disclosures is documented below. The</w:t>
+        <w:t xml:space="preserve">The paper also raises concerns about the role of economic expertise.</w:t>
+      </w:r>
+      <w:r>
+        <w:t xml:space="preserve"> </w:t>
+      </w:r>
+      <w:r>
+        <w:t xml:space="preserve">Card’s report was produced for litigation and stated its predictions</w:t>
+      </w:r>
+      <w:r>
+        <w:t xml:space="preserve"> </w:t>
+      </w:r>
+      <w:r>
+        <w:t xml:space="preserve">in units that correspond to no publicly reported statistic. The</w:t>
+      </w:r>
+      <w:r>
+        <w:t xml:space="preserve"> </w:t>
+      </w:r>
+      <w:r>
+        <w:t xml:space="preserve">analyses on the plaintiff’s side did enter scholarly journals</w:t>
+      </w:r>
+      <w:r>
+        <w:t xml:space="preserve"> </w:t>
+      </w:r>
+      <w:r>
+        <w:t xml:space="preserve">(Arcidiacono, Kinsler, and Ransom 2022a, 2022b), but the defense</w:t>
+      </w:r>
+      <w:r>
+        <w:t xml:space="preserve"> </w:t>
+      </w:r>
+      <w:r>
+        <w:t xml:space="preserve">simulation by Card that became the public reference point did not,</w:t>
+      </w:r>
+      <w:r>
+        <w:t xml:space="preserve"> </w:t>
+      </w:r>
+      <w:r>
+        <w:t xml:space="preserve">and no mapping between its conventions and the CDS categories has</w:t>
+      </w:r>
+      <w:r>
+        <w:t xml:space="preserve"> </w:t>
+      </w:r>
+      <w:r>
+        <w:t xml:space="preserve">previously been published. Harvard’s post-ruling disclosures,</w:t>
+      </w:r>
+      <w:r>
+        <w:t xml:space="preserve"> </w:t>
+      </w:r>
+      <w:r>
+        <w:t xml:space="preserve">documented below, illustrate the consequence: the university’s</w:t>
+      </w:r>
+      <w:r>
+        <w:t xml:space="preserve"> </w:t>
+      </w:r>
+      <w:r>
+        <w:t xml:space="preserve">announcements and its federal filings describe the same entering</w:t>
+      </w:r>
+      <w:r>
+        <w:t xml:space="preserve"> </w:t>
+      </w:r>
+      <w:r>
+        <w:t xml:space="preserve">classes with Black shares that differ by nearly a factor of two. The</w:t>
       </w:r>
       <w:r>
         <w:t xml:space="preserve"> </w:t>
@@ -1000,55 +1082,410 @@
         <w:t xml:space="preserve"> </w:t>
       </w:r>
       <w:r>
-        <w:t xml:space="preserve">the attention they do. The first post-ruling cycle has begun to attract</w:t>
-      </w:r>
-      <w:r>
-        <w:t xml:space="preserve"> </w:t>
-      </w:r>
-      <w:r>
-        <w:t xml:space="preserve">systematic study. Bloem et al. (2026) link national testing cohorts to</w:t>
-      </w:r>
-      <w:r>
-        <w:t xml:space="preserve"> </w:t>
-      </w:r>
-      <w:r>
-        <w:t xml:space="preserve">fall 2024 enrollment records and document underrepresented minority</w:t>
-      </w:r>
-      <w:r>
-        <w:t xml:space="preserve"> </w:t>
-      </w:r>
-      <w:r>
-        <w:t xml:space="preserve">enrollees cascading down the selectivity distribution in the ruling’s</w:t>
-      </w:r>
-      <w:r>
-        <w:t xml:space="preserve"> </w:t>
-      </w:r>
-      <w:r>
-        <w:t xml:space="preserve">first year. Their estimates are measured against</w:t>
-      </w:r>
-      <w:r>
-        <w:t xml:space="preserve"> </w:t>
-      </w:r>
-      <w:r>
-        <w:t xml:space="preserve">the fall 2021-2023 entering classes, the elevated post-2020 cohorts</w:t>
-      </w:r>
-      <w:r>
-        <w:t xml:space="preserve"> </w:t>
-      </w:r>
-      <w:r>
-        <w:t xml:space="preserve">examined below. Measured against the 2010-2015 litigation-era baseline,</w:t>
-      </w:r>
-      <w:r>
-        <w:t xml:space="preserve"> </w:t>
-      </w:r>
-      <w:r>
-        <w:t xml:space="preserve">the same institutions show the stability documented in this paper. What no part of this literature yet</w:t>
-      </w:r>
-      <w:r>
-        <w:t xml:space="preserve"> </w:t>
-      </w:r>
-      <w:r>
-        <w:t xml:space="preserve">contains is a comparison of the</w:t>
+        <w:t xml:space="preserve">the attention they do.</w:t>
+      </w:r>
+    </w:p>
+    <w:p>
+      <w:pPr>
+        <w:pStyle w:val="BodyText"/>
+      </w:pPr>
+      <w:r>
+        <w:t xml:space="preserve">The first post-ruling admissions cycle, for the class entering in</w:t>
+      </w:r>
+      <w:r>
+        <w:t xml:space="preserve"> </w:t>
+      </w:r>
+      <w:r>
+        <w:t xml:space="preserve">fall 2024, attracted systematic study. Bloem</w:t>
+      </w:r>
+      <w:r>
+        <w:t xml:space="preserve"> </w:t>
+      </w:r>
+      <w:r>
+        <w:t xml:space="preserve">et al. (2026) examine how students’ college destinations changed in</w:t>
+      </w:r>
+      <w:r>
+        <w:t xml:space="preserve"> </w:t>
+      </w:r>
+      <w:r>
+        <w:t xml:space="preserve">the ruling’s first year, linking more than twelve million College</w:t>
+      </w:r>
+      <w:r>
+        <w:t xml:space="preserve"> </w:t>
+      </w:r>
+      <w:r>
+        <w:t xml:space="preserve">Board test takers to their college enrollment records. Their</w:t>
+      </w:r>
+      <w:r>
+        <w:t xml:space="preserve"> </w:t>
+      </w:r>
+      <w:r>
+        <w:t xml:space="preserve">baseline is the fall 2021 through 2023 entering classes, the</w:t>
+      </w:r>
+      <w:r>
+        <w:t xml:space="preserve"> </w:t>
+      </w:r>
+      <w:r>
+        <w:t xml:space="preserve">elevated post-2020 cohorts visible in</w:t>
+      </w:r>
+      <w:r>
+        <w:t xml:space="preserve"> </w:t>
+      </w:r>
+      <w:hyperlink w:anchor="fig-black">
+        <w:r>
+          <w:rPr>
+            <w:rStyle w:val="Hyperlink"/>
+          </w:rPr>
+          <w:t xml:space="preserve">Figure 1</w:t>
+        </w:r>
+      </w:hyperlink>
+      <w:r>
+        <w:t xml:space="preserve"> </w:t>
+      </w:r>
+      <w:r>
+        <w:t xml:space="preserve">below, their</w:t>
+      </w:r>
+      <w:r>
+        <w:t xml:space="preserve"> </w:t>
+      </w:r>
+      <w:r>
+        <w:t xml:space="preserve">institutional groups are defined by pre-pandemic acceptance rates,</w:t>
+      </w:r>
+      <w:r>
+        <w:t xml:space="preserve"> </w:t>
+      </w:r>
+      <w:r>
+        <w:t xml:space="preserve">and their headline measure combines all underrepresented minority</w:t>
+      </w:r>
+      <w:r>
+        <w:t xml:space="preserve"> </w:t>
+      </w:r>
+      <w:r>
+        <w:t xml:space="preserve">students among first-year domestic enrollees. They estimate that</w:t>
+      </w:r>
+      <w:r>
+        <w:t xml:space="preserve"> </w:t>
+      </w:r>
+      <w:r>
+        <w:t xml:space="preserve">the underrepresented minority share at highly selective colleges</w:t>
+      </w:r>
+      <w:r>
+        <w:t xml:space="preserve"> </w:t>
+      </w:r>
+      <w:r>
+        <w:t xml:space="preserve">fell 4 to 5 percentage points in fall 2024, about 18 percent, with</w:t>
+      </w:r>
+      <w:r>
+        <w:t xml:space="preserve"> </w:t>
+      </w:r>
+      <w:r>
+        <w:t xml:space="preserve">displaced students cascading into less selective institutions and</w:t>
+      </w:r>
+      <w:r>
+        <w:t xml:space="preserve"> </w:t>
+      </w:r>
+      <w:r>
+        <w:t xml:space="preserve">the offsetting gains at the most selective colleges accruing, in</w:t>
+      </w:r>
+      <w:r>
+        <w:t xml:space="preserve"> </w:t>
+      </w:r>
+      <w:r>
+        <w:t xml:space="preserve">their accounting, to White students.</w:t>
+      </w:r>
+    </w:p>
+    <w:p>
+      <w:pPr>
+        <w:pStyle w:val="BodyText"/>
+      </w:pPr>
+      <w:r>
+        <w:t xml:space="preserve">Snider (2026) examines how the ruling changed the racial and</w:t>
+      </w:r>
+      <w:r>
+        <w:t xml:space="preserve"> </w:t>
+      </w:r>
+      <w:r>
+        <w:t xml:space="preserve">socioeconomic composition of entering classes across the whole</w:t>
+      </w:r>
+      <w:r>
+        <w:t xml:space="preserve"> </w:t>
+      </w:r>
+      <w:r>
+        <w:t xml:space="preserve">selectivity distribution, using IPEDS records for 2018 through</w:t>
+      </w:r>
+      <w:r>
+        <w:t xml:space="preserve"> </w:t>
+      </w:r>
+      <w:r>
+        <w:t xml:space="preserve">2024, full-time first-time students, and institutional tiers from</w:t>
+      </w:r>
+      <w:r>
+        <w:t xml:space="preserve"> </w:t>
+      </w:r>
+      <w:r>
+        <w:t xml:space="preserve">Barron’s ratings. In raw first differences, her Table 1 shows the</w:t>
+      </w:r>
+      <w:r>
+        <w:t xml:space="preserve"> </w:t>
+      </w:r>
+      <w:r>
+        <w:t xml:space="preserve">Black share of first-years at the two most selective tiers falling</w:t>
+      </w:r>
+      <w:r>
+        <w:t xml:space="preserve"> </w:t>
+      </w:r>
+      <w:r>
+        <w:t xml:space="preserve">from 5.6 percent over 2018-2023 to 5.1 percent in fall 2024, about</w:t>
+      </w:r>
+      <w:r>
+        <w:t xml:space="preserve"> </w:t>
+      </w:r>
+      <w:r>
+        <w:t xml:space="preserve">9 percent, with the White share falling three points and Black</w:t>
+      </w:r>
+      <w:r>
+        <w:t xml:space="preserve"> </w:t>
+      </w:r>
+      <w:r>
+        <w:t xml:space="preserve">enrollment growing at non-selective institutions. Her preferred difference-in-differences estimates,</w:t>
+      </w:r>
+      <w:r>
+        <w:t xml:space="preserve"> </w:t>
+      </w:r>
+      <w:r>
+        <w:t xml:space="preserve">which adjust for the differing pre-2024 trends across tiers, put</w:t>
+      </w:r>
+      <w:r>
+        <w:t xml:space="preserve"> </w:t>
+      </w:r>
+      <w:r>
+        <w:t xml:space="preserve">the Black decline at 20 percent at the two most selective tiers,</w:t>
+      </w:r>
+      <w:r>
+        <w:t xml:space="preserve"> </w:t>
+      </w:r>
+      <w:r>
+        <w:t xml:space="preserve">concentrated at private institutions, with White shares rising</w:t>
+      </w:r>
+      <w:r>
+        <w:t xml:space="preserve"> </w:t>
+      </w:r>
+      <w:r>
+        <w:t xml:space="preserve">rather than falling.</w:t>
+      </w:r>
+    </w:p>
+    <w:p>
+      <w:pPr>
+        <w:pStyle w:val="BodyText"/>
+      </w:pPr>
+      <w:r>
+        <w:t xml:space="preserve">Murphy (2026) offers the broadest descriptive accounting of the</w:t>
+      </w:r>
+      <w:r>
+        <w:t xml:space="preserve"> </w:t>
+      </w:r>
+      <w:r>
+        <w:t xml:space="preserve">ruling’s first year, covering first-time enrollment at 3,198</w:t>
+      </w:r>
+      <w:r>
+        <w:t xml:space="preserve"> </w:t>
+      </w:r>
+      <w:r>
+        <w:t xml:space="preserve">institutions of every kind. His baseline is the average of the 2022</w:t>
+      </w:r>
+      <w:r>
+        <w:t xml:space="preserve"> </w:t>
+      </w:r>
+      <w:r>
+        <w:t xml:space="preserve">and 2023 entering classes, and his groups are defined by 2024</w:t>
+      </w:r>
+      <w:r>
+        <w:t xml:space="preserve"> </w:t>
+      </w:r>
+      <w:r>
+        <w:t xml:space="preserve">acceptance rates along with a twelve-school Ivy Plus cohort. At the</w:t>
+      </w:r>
+      <w:r>
+        <w:t xml:space="preserve"> </w:t>
+      </w:r>
+      <w:r>
+        <w:t xml:space="preserve">Ivy Plus schools the Black share of the entering class fell just</w:t>
+      </w:r>
+      <w:r>
+        <w:t xml:space="preserve"> </w:t>
+      </w:r>
+      <w:r>
+        <w:t xml:space="preserve">over two percentage points, a 25 percent relative decline, while</w:t>
+      </w:r>
+      <w:r>
+        <w:t xml:space="preserve"> </w:t>
+      </w:r>
+      <w:r>
+        <w:t xml:space="preserve">Black freshman enrollment rose at most state flagships and Asian</w:t>
+      </w:r>
+      <w:r>
+        <w:t xml:space="preserve"> </w:t>
+      </w:r>
+      <w:r>
+        <w:t xml:space="preserve">American freshman counts at the Ivy Plus schools grew 7 percent.</w:t>
+      </w:r>
+    </w:p>
+    <w:p>
+      <w:pPr>
+        <w:pStyle w:val="BodyText"/>
+      </w:pPr>
+      <w:r>
+        <w:t xml:space="preserve">These studies and this paper differ along four dimensions, and each</w:t>
+      </w:r>
+      <w:r>
+        <w:t xml:space="preserve"> </w:t>
+      </w:r>
+      <w:r>
+        <w:t xml:space="preserve">choice is reasonable for its purpose. The baselines differ:</w:t>
+      </w:r>
+      <w:r>
+        <w:t xml:space="preserve"> </w:t>
+      </w:r>
+      <w:r>
+        <w:t xml:space="preserve">2021-2023, 2018-2023, and the average of 2022 and 2023, against</w:t>
+      </w:r>
+      <w:r>
+        <w:t xml:space="preserve"> </w:t>
+      </w:r>
+      <w:r>
+        <w:t xml:space="preserve">this paper’s 2010-2015. I use the litigation window because the</w:t>
+      </w:r>
+      <w:r>
+        <w:t xml:space="preserve"> </w:t>
+      </w:r>
+      <w:r>
+        <w:t xml:space="preserve">litigation is my subject. The forecasts under examination were</w:t>
+      </w:r>
+      <w:r>
+        <w:t xml:space="preserve"> </w:t>
+      </w:r>
+      <w:r>
+        <w:t xml:space="preserve">largely estimated on data from those years, and the litigation, not</w:t>
+      </w:r>
+      <w:r>
+        <w:t xml:space="preserve"> </w:t>
+      </w:r>
+      <w:r>
+        <w:t xml:space="preserve">I, fixed the period. The institutional groupings differ: acceptance-rate</w:t>
+      </w:r>
+      <w:r>
+        <w:t xml:space="preserve"> </w:t>
+      </w:r>
+      <w:r>
+        <w:t xml:space="preserve">cutoffs and Barron’s tiers, against the groups that actually spoke</w:t>
+      </w:r>
+      <w:r>
+        <w:t xml:space="preserve"> </w:t>
+      </w:r>
+      <w:r>
+        <w:t xml:space="preserve">in the case, Harvard, the fifteen research universities, and the</w:t>
+      </w:r>
+      <w:r>
+        <w:t xml:space="preserve"> </w:t>
+      </w:r>
+      <w:r>
+        <w:t xml:space="preserve">thirty-three amici colleges. The measurements differ in both</w:t>
+      </w:r>
+      <w:r>
+        <w:t xml:space="preserve"> </w:t>
+      </w:r>
+      <w:r>
+        <w:t xml:space="preserve">numerator and denominator: Black students alone or all</w:t>
+      </w:r>
+      <w:r>
+        <w:t xml:space="preserve"> </w:t>
+      </w:r>
+      <w:r>
+        <w:t xml:space="preserve">underrepresented minorities, over whole classes, domestic students,</w:t>
+      </w:r>
+      <w:r>
+        <w:t xml:space="preserve"> </w:t>
+      </w:r>
+      <w:r>
+        <w:t xml:space="preserve">or full-time enrollees. None of the three examines the ratio of</w:t>
+      </w:r>
+      <w:r>
+        <w:t xml:space="preserve"> </w:t>
+      </w:r>
+      <w:r>
+        <w:t xml:space="preserve">Asian to Black first-years, the statistic closest to the</w:t>
+      </w:r>
+      <w:r>
+        <w:t xml:space="preserve"> </w:t>
+      </w:r>
+      <w:r>
+        <w:t xml:space="preserve">discrimination claim on which the case was brought. And the outcome</w:t>
+      </w:r>
+      <w:r>
+        <w:t xml:space="preserve"> </w:t>
+      </w:r>
+      <w:r>
+        <w:t xml:space="preserve">windows differ: all three studies stop at fall 2024, while this</w:t>
+      </w:r>
+      <w:r>
+        <w:t xml:space="preserve"> </w:t>
+      </w:r>
+      <w:r>
+        <w:t xml:space="preserve">paper adds fall 2025, the cycle in which several of the largest</w:t>
+      </w:r>
+      <w:r>
+        <w:t xml:space="preserve"> </w:t>
+      </w:r>
+      <w:r>
+        <w:t xml:space="preserve">first-year movements reversed. These choices matter for the</w:t>
+      </w:r>
+      <w:r>
+        <w:t xml:space="preserve"> </w:t>
+      </w:r>
+      <w:r>
+        <w:t xml:space="preserve">headline number, which ranges from about 9 percent to 25 percent</w:t>
+      </w:r>
+      <w:r>
+        <w:t xml:space="preserve"> </w:t>
+      </w:r>
+      <w:r>
+        <w:t xml:space="preserve">across the three studies. They do not matter for the conclusion of</w:t>
+      </w:r>
+      <w:r>
+        <w:t xml:space="preserve"> </w:t>
+      </w:r>
+      <w:r>
+        <w:t xml:space="preserve">this paper. My estimates are in harmony with theirs once the</w:t>
+      </w:r>
+      <w:r>
+        <w:t xml:space="preserve"> </w:t>
+      </w:r>
+      <w:r>
+        <w:t xml:space="preserve">baselines are aligned, and under every baseline, grouping, and</w:t>
+      </w:r>
+      <w:r>
+        <w:t xml:space="preserve"> </w:t>
+      </w:r>
+      <w:r>
+        <w:t xml:space="preserve">measure, the change in Black enrollment at elite institutions falls</w:t>
+      </w:r>
+      <w:r>
+        <w:t xml:space="preserve"> </w:t>
+      </w:r>
+      <w:r>
+        <w:t xml:space="preserve">well short of the 50 to 70 percent decline the institutions</w:t>
+      </w:r>
+      <w:r>
+        <w:t xml:space="preserve"> </w:t>
+      </w:r>
+      <w:r>
+        <w:t xml:space="preserve">themselves forecast. What this literature still does not contain is a</w:t>
+      </w:r>
+      <w:r>
+        <w:t xml:space="preserve"> </w:t>
+      </w:r>
+      <w:r>
+        <w:t xml:space="preserve">comparison of the</w:t>
       </w:r>
       <w:r>
         <w:t xml:space="preserve"> </w:t>
@@ -1064,31 +1501,31 @@
         <w:t xml:space="preserve"> </w:t>
       </w:r>
       <w:r>
-        <w:t xml:space="preserve">predictions with realized</w:t>
-      </w:r>
-      <w:r>
-        <w:t xml:space="preserve"> </w:t>
-      </w:r>
-      <w:r>
-        <w:t xml:space="preserve">post-ruling enrollment, stated in the units in which the predictions were issued and measured against the baseline the predictions themselves referenced.</w:t>
-      </w:r>
-      <w:r>
-        <w:t xml:space="preserve"> </w:t>
-      </w:r>
-      <w:r>
-        <w:t xml:space="preserve">The prediction side of the record closed in 2023. The outcome side, now</w:t>
-      </w:r>
-      <w:r>
-        <w:t xml:space="preserve"> </w:t>
-      </w:r>
-      <w:r>
-        <w:t xml:space="preserve">two entering classes deep, sits in public filings, and the remainder of</w:t>
-      </w:r>
-      <w:r>
-        <w:t xml:space="preserve"> </w:t>
-      </w:r>
-      <w:r>
-        <w:t xml:space="preserve">this paper performs the comparison.</w:t>
+        <w:t xml:space="preserve">predictions with realized post-ruling</w:t>
+      </w:r>
+      <w:r>
+        <w:t xml:space="preserve"> </w:t>
+      </w:r>
+      <w:r>
+        <w:t xml:space="preserve">enrollment, stated in the units in which the predictions were</w:t>
+      </w:r>
+      <w:r>
+        <w:t xml:space="preserve"> </w:t>
+      </w:r>
+      <w:r>
+        <w:t xml:space="preserve">issued. The prediction side of the record closed in 2023. The</w:t>
+      </w:r>
+      <w:r>
+        <w:t xml:space="preserve"> </w:t>
+      </w:r>
+      <w:r>
+        <w:t xml:space="preserve">outcome side, now two entering classes deep, sits in public</w:t>
+      </w:r>
+      <w:r>
+        <w:t xml:space="preserve"> </w:t>
+      </w:r>
+      <w:r>
+        <w:t xml:space="preserve">filings, and the remainder of this paper performs the comparison.</w:t>
       </w:r>
     </w:p>
     <w:bookmarkEnd w:id="9"/>
@@ -1248,43 +1685,49 @@
         <w:t xml:space="preserve"> </w:t>
       </w:r>
       <w:r>
-        <w:t xml:space="preserve">applicants outside the regression model. None of this makes the sample</w:t>
-      </w:r>
-      <w:r>
-        <w:t xml:space="preserve"> </w:t>
-      </w:r>
-      <w:r>
-        <w:t xml:space="preserve">unusable as a baseline. The conversion developed below does not require</w:t>
-      </w:r>
-      <w:r>
-        <w:t xml:space="preserve"> </w:t>
-      </w:r>
-      <w:r>
-        <w:t xml:space="preserve">Card’s sample to match the enrolled class member for member, only that</w:t>
-      </w:r>
-      <w:r>
-        <w:t xml:space="preserve"> </w:t>
-      </w:r>
-      <w:r>
-        <w:t xml:space="preserve">the relationship between his population and the enrolled class be</w:t>
-      </w:r>
-      <w:r>
-        <w:t xml:space="preserve"> </w:t>
-      </w:r>
-      <w:r>
-        <w:t xml:space="preserve">stable, an assumption that cannot be verified from public data and</w:t>
-      </w:r>
-      <w:r>
-        <w:t xml:space="preserve"> </w:t>
-      </w:r>
-      <w:r>
-        <w:t xml:space="preserve">whose plausible failures, examined below, mostly run against the paper’s</w:t>
-      </w:r>
-      <w:r>
-        <w:t xml:space="preserve"> </w:t>
-      </w:r>
-      <w:r>
-        <w:t xml:space="preserve">conclusion.</w:t>
+        <w:t xml:space="preserve">applicants outside the regression model. None of this makes the sample unusable as a baseline. The</w:t>
+      </w:r>
+      <w:r>
+        <w:t xml:space="preserve"> </w:t>
+      </w:r>
+      <w:r>
+        <w:t xml:space="preserve">conversion developed below does not require Card’s sample to match</w:t>
+      </w:r>
+      <w:r>
+        <w:t xml:space="preserve"> </w:t>
+      </w:r>
+      <w:r>
+        <w:t xml:space="preserve">the enrolled class member for member, only that the relationship</w:t>
+      </w:r>
+      <w:r>
+        <w:t xml:space="preserve"> </w:t>
+      </w:r>
+      <w:r>
+        <w:t xml:space="preserve">between his population and the enrolled class be stable. That</w:t>
+      </w:r>
+      <w:r>
+        <w:t xml:space="preserve"> </w:t>
+      </w:r>
+      <w:r>
+        <w:t xml:space="preserve">assumption cannot be verified from public data, but as discussed</w:t>
+      </w:r>
+      <w:r>
+        <w:t xml:space="preserve"> </w:t>
+      </w:r>
+      <w:r>
+        <w:t xml:space="preserve">below, the plausible ways it could fail would lower the converted</w:t>
+      </w:r>
+      <w:r>
+        <w:t xml:space="preserve"> </w:t>
+      </w:r>
+      <w:r>
+        <w:t xml:space="preserve">benchmark and so strengthen, rather than weaken, this paper’s</w:t>
+      </w:r>
+      <w:r>
+        <w:t xml:space="preserve"> </w:t>
+      </w:r>
+      <w:r>
+        <w:t xml:space="preserve">finding of no change.</w:t>
       </w:r>
     </w:p>
     <w:p>
@@ -1788,25 +2231,43 @@
         <w:t xml:space="preserve"> </w:t>
       </w:r>
       <w:r>
-        <w:t xml:space="preserve">Sixteen economists and statisticians answered in support of Harvard,</w:t>
-      </w:r>
-      <w:r>
-        <w:t xml:space="preserve"> </w:t>
-      </w:r>
-      <w:r>
-        <w:t xml:space="preserve">among them three Nobel laureates, George Akerlof, Robert Solow, and Guido</w:t>
-      </w:r>
-      <w:r>
-        <w:t xml:space="preserve"> </w:t>
-      </w:r>
-      <w:r>
-        <w:t xml:space="preserve">Imbens, the last a co-recipient of the 2021 prize that Card</w:t>
-      </w:r>
-      <w:r>
-        <w:t xml:space="preserve"> </w:t>
-      </w:r>
-      <w:r>
-        <w:t xml:space="preserve">shared. Their brief attested that Card</w:t>
+        <w:t xml:space="preserve">Sixteen economists and statisticians (George A. Akerlof, Sandy Baum,</w:t>
+      </w:r>
+      <w:r>
+        <w:t xml:space="preserve"> </w:t>
+      </w:r>
+      <w:r>
+        <w:t xml:space="preserve">Rebecca M. Blank, Hilary Hoynes, Guido W. Imbens, Kirabo Jackson,</w:t>
+      </w:r>
+      <w:r>
+        <w:t xml:space="preserve"> </w:t>
+      </w:r>
+      <w:r>
+        <w:t xml:space="preserve">Rucker Johnson, Helen F. Ladd, David S. Lee, Trevon D. Logan, Michael</w:t>
+      </w:r>
+      <w:r>
+        <w:t xml:space="preserve"> </w:t>
+      </w:r>
+      <w:r>
+        <w:t xml:space="preserve">McPherson, Jesse Rothstein, Robert M. Solow, Sarah Turner, Ebonya</w:t>
+      </w:r>
+      <w:r>
+        <w:t xml:space="preserve"> </w:t>
+      </w:r>
+      <w:r>
+        <w:t xml:space="preserve">Washington, and Douglas Webber) answered in support of Harvard, among</w:t>
+      </w:r>
+      <w:r>
+        <w:t xml:space="preserve"> </w:t>
+      </w:r>
+      <w:r>
+        <w:t xml:space="preserve">them three Nobel laureates: Akerlof, Solow, and Imbens, the last a</w:t>
+      </w:r>
+      <w:r>
+        <w:t xml:space="preserve"> </w:t>
+      </w:r>
+      <w:r>
+        <w:t xml:space="preserve">co-recipient of the 2021 prize that Card shared. Their brief attested that Card</w:t>
       </w:r>
       <w:r>
         <w:t xml:space="preserve"> </w:t>
@@ -2056,6 +2517,176 @@
       </w:r>
       <w:r>
         <w:t xml:space="preserve">below). All statistics below refer to first-time first-year students.</w:t>
+      </w:r>
+    </w:p>
+    <w:p>
+      <w:pPr>
+        <w:pStyle w:val="BodyText"/>
+      </w:pPr>
+      <w:r>
+        <w:t xml:space="preserve">All comparisons below require a pre-ruling baseline, and the</w:t>
+      </w:r>
+      <w:r>
+        <w:t xml:space="preserve"> </w:t>
+      </w:r>
+      <w:r>
+        <w:t xml:space="preserve">baseline I use is the entering classes of fall 2010 through fall</w:t>
+      </w:r>
+      <w:r>
+        <w:t xml:space="preserve"> </w:t>
+      </w:r>
+      <w:r>
+        <w:t xml:space="preserve">2015. The litigation supplies this window. Card estimated his</w:t>
+      </w:r>
+      <w:r>
+        <w:t xml:space="preserve"> </w:t>
+      </w:r>
+      <w:r>
+        <w:t xml:space="preserve">admissions models on applicants to the Classes of 2014 through</w:t>
+      </w:r>
+      <w:r>
+        <w:t xml:space="preserve"> </w:t>
+      </w:r>
+      <w:r>
+        <w:t xml:space="preserve">2019, that is, the classes entering in the falls of 2010 through</w:t>
+      </w:r>
+      <w:r>
+        <w:t xml:space="preserve"> </w:t>
+      </w:r>
+      <w:r>
+        <w:t xml:space="preserve">2015, and the admissions modeling in the case ended with those</w:t>
+      </w:r>
+      <w:r>
+        <w:t xml:space="preserve"> </w:t>
+      </w:r>
+      <w:r>
+        <w:t xml:space="preserve">cohorts.</w:t>
+      </w:r>
+      <w:r>
+        <w:t xml:space="preserve"> </w:t>
+      </w:r>
+      <w:r>
+        <w:t xml:space="preserve">Testing the litigation’s forecasts against the litigation’s own</w:t>
+      </w:r>
+      <w:r>
+        <w:t xml:space="preserve"> </w:t>
+      </w:r>
+      <w:r>
+        <w:t xml:space="preserve">data window is the point of this paper. The window is exact for</w:t>
+      </w:r>
+      <w:r>
+        <w:t xml:space="preserve"> </w:t>
+      </w:r>
+      <w:r>
+        <w:t xml:space="preserve">Card. The amici built on older data still, a 1989 entering cohort,</w:t>
+      </w:r>
+      <w:r>
+        <w:t xml:space="preserve"> </w:t>
+      </w:r>
+      <w:r>
+        <w:t xml:space="preserve">and specified no window of their own, so their proportional</w:t>
+      </w:r>
+      <w:r>
+        <w:t xml:space="preserve"> </w:t>
+      </w:r>
+      <w:r>
+        <w:t xml:space="preserve">forecast is also evaluated below against four alternative</w:t>
+      </w:r>
+      <w:r>
+        <w:t xml:space="preserve"> </w:t>
+      </w:r>
+      <w:r>
+        <w:t xml:space="preserve">pre-periods, with results insensitive to the choice. The research</w:t>
+      </w:r>
+      <w:r>
+        <w:t xml:space="preserve"> </w:t>
+      </w:r>
+      <w:r>
+        <w:t xml:space="preserve">universities supplied no data of their own, borrowing their one</w:t>
+      </w:r>
+      <w:r>
+        <w:t xml:space="preserve"> </w:t>
+      </w:r>
+      <w:r>
+        <w:t xml:space="preserve">number from the trial record, and so raise no separate window.</w:t>
+      </w:r>
+      <w:r>
+        <w:t xml:space="preserve"> </w:t>
+      </w:r>
+      <w:r>
+        <w:t xml:space="preserve">Other windows</w:t>
+      </w:r>
+      <w:r>
+        <w:t xml:space="preserve"> </w:t>
+      </w:r>
+      <w:r>
+        <w:t xml:space="preserve">are reasonable for other</w:t>
+      </w:r>
+      <w:r>
+        <w:t xml:space="preserve"> </w:t>
+      </w:r>
+      <w:r>
+        <w:t xml:space="preserve">purposes, and the studies reviewed above use them: Snider (2026)</w:t>
+      </w:r>
+      <w:r>
+        <w:t xml:space="preserve"> </w:t>
+      </w:r>
+      <w:r>
+        <w:t xml:space="preserve">measures against 2018-2023, Murphy (2026) against the average of</w:t>
+      </w:r>
+      <w:r>
+        <w:t xml:space="preserve"> </w:t>
+      </w:r>
+      <w:r>
+        <w:t xml:space="preserve">2022 and 2023, and Bloem et al. (2026) against 2021-2023. Because</w:t>
+      </w:r>
+      <w:r>
+        <w:t xml:space="preserve"> </w:t>
+      </w:r>
+      <w:r>
+        <w:t xml:space="preserve">Black enrollment rose sharply after 2020, those later baselines sit</w:t>
+      </w:r>
+      <w:r>
+        <w:t xml:space="preserve"> </w:t>
+      </w:r>
+      <w:r>
+        <w:t xml:space="preserve">above the litigation window, and against them the post-ruling</w:t>
+      </w:r>
+      <w:r>
+        <w:t xml:space="preserve"> </w:t>
+      </w:r>
+      <w:r>
+        <w:t xml:space="preserve">classes show modest declines. Where the difference matters, I</w:t>
+      </w:r>
+      <w:r>
+        <w:t xml:space="preserve"> </w:t>
+      </w:r>
+      <w:r>
+        <w:t xml:space="preserve">report both comparisons. The choice of baseline changes the sign</w:t>
+      </w:r>
+      <w:r>
+        <w:t xml:space="preserve"> </w:t>
+      </w:r>
+      <w:r>
+        <w:t xml:space="preserve">and the size of the measured change. It does not move the</w:t>
+      </w:r>
+      <w:r>
+        <w:t xml:space="preserve"> </w:t>
+      </w:r>
+      <w:r>
+        <w:t xml:space="preserve">conclusion. Against any of these baselines, the change in Black</w:t>
+      </w:r>
+      <w:r>
+        <w:t xml:space="preserve"> </w:t>
+      </w:r>
+      <w:r>
+        <w:t xml:space="preserve">enrollment falls well short of the 50 to 70 percent decline the</w:t>
+      </w:r>
+      <w:r>
+        <w:t xml:space="preserve"> </w:t>
+      </w:r>
+      <w:r>
+        <w:t xml:space="preserve">institutions forecast.</w:t>
       </w:r>
     </w:p>
     <w:p>
@@ -2975,13 +3606,55 @@
         <w:t xml:space="preserve"> </w:t>
       </w:r>
       <w:r>
-        <w:t xml:space="preserve">narrows, the measured gap. In summary, the filings contain no evidence</w:t>
-      </w:r>
-      <w:r>
-        <w:t xml:space="preserve"> </w:t>
-      </w:r>
-      <w:r>
-        <w:t xml:space="preserve">of movement toward race-blind admissions.</w:t>
+        <w:t xml:space="preserve">narrows, the measured gap. In summary, measured against the litigation</w:t>
+      </w:r>
+      <w:r>
+        <w:t xml:space="preserve"> </w:t>
+      </w:r>
+      <w:r>
+        <w:t xml:space="preserve">window, the filings contain no evidence of movement toward race-blind</w:t>
+      </w:r>
+      <w:r>
+        <w:t xml:space="preserve"> </w:t>
+      </w:r>
+      <w:r>
+        <w:t xml:space="preserve">admissions. Measured against the elevated classes of fall 2020 through</w:t>
+      </w:r>
+      <w:r>
+        <w:t xml:space="preserve"> </w:t>
+      </w:r>
+      <w:r>
+        <w:t xml:space="preserve">2023, whose mean US Black share was</w:t>
+      </w:r>
+      <w:r>
+        <w:t xml:space="preserve"> </w:t>
+      </w:r>
+      <w:r>
+        <w:t xml:space="preserve">11.8</w:t>
+      </w:r>
+      <w:r>
+        <w:t xml:space="preserve"> </w:t>
+      </w:r>
+      <w:r>
+        <w:t xml:space="preserve">percent, they show a decline of roughly</w:t>
+      </w:r>
+      <w:r>
+        <w:t xml:space="preserve"> </w:t>
+      </w:r>
+      <w:r>
+        <w:t xml:space="preserve">37</w:t>
+      </w:r>
+      <w:r>
+        <w:t xml:space="preserve"> </w:t>
+      </w:r>
+      <w:r>
+        <w:t xml:space="preserve">percent, well short of the more-than-half decline that Card’s model</w:t>
+      </w:r>
+      <w:r>
+        <w:t xml:space="preserve"> </w:t>
+      </w:r>
+      <w:r>
+        <w:t xml:space="preserve">implies genuinely race-blind admission would produce.</w:t>
       </w:r>
     </w:p>
     <w:bookmarkEnd w:id="14"/>
@@ -3089,49 +3762,85 @@
         <w:t xml:space="preserve"> </w:t>
       </w:r>
       <w:r>
-        <w:t xml:space="preserve">difference presumably attributable to the timing of the fall census. An</w:t>
-      </w:r>
-      <w:r>
-        <w:t xml:space="preserve"> </w:t>
-      </w:r>
-      <w:r>
-        <w:t xml:space="preserve">institution whose public number reproduces its litigation-era level while</w:t>
-      </w:r>
-      <w:r>
-        <w:t xml:space="preserve"> </w:t>
-      </w:r>
-      <w:r>
-        <w:t xml:space="preserve">its federal number halves that level enjoys considerable interpretive</w:t>
-      </w:r>
-      <w:r>
-        <w:t xml:space="preserve"> </w:t>
-      </w:r>
-      <w:r>
-        <w:t xml:space="preserve">latitude. Where the categories of expert analysis, public</w:t>
-      </w:r>
-      <w:r>
-        <w:t xml:space="preserve"> </w:t>
-      </w:r>
-      <w:r>
-        <w:t xml:space="preserve">communication, and</w:t>
-      </w:r>
-      <w:r>
-        <w:t xml:space="preserve"> </w:t>
-      </w:r>
-      <w:r>
-        <w:t xml:space="preserve">statutory reporting fail to correspond, enrollment outcomes cannot be</w:t>
-      </w:r>
-      <w:r>
-        <w:t xml:space="preserve"> </w:t>
-      </w:r>
-      <w:r>
-        <w:t xml:space="preserve">monitored by inspection, and claims of compliance or of catastrophe can</w:t>
-      </w:r>
-      <w:r>
-        <w:t xml:space="preserve"> </w:t>
-      </w:r>
-      <w:r>
-        <w:t xml:space="preserve">each find a supporting statistic.</w:t>
+        <w:t xml:space="preserve">difference presumably attributable to the timing of the fall census.</w:t>
+      </w:r>
+      <w:r>
+        <w:t xml:space="preserve"> </w:t>
+      </w:r>
+      <w:r>
+        <w:t xml:space="preserve">The point is not that either number is wrong. Each is computed</w:t>
+      </w:r>
+      <w:r>
+        <w:t xml:space="preserve"> </w:t>
+      </w:r>
+      <w:r>
+        <w:t xml:space="preserve">correctly under its own convention. The point is that the two</w:t>
+      </w:r>
+      <w:r>
+        <w:t xml:space="preserve"> </w:t>
+      </w:r>
+      <w:r>
+        <w:t xml:space="preserve">conventions tell different stories about the same students. Read</w:t>
+      </w:r>
+      <w:r>
+        <w:t xml:space="preserve"> </w:t>
+      </w:r>
+      <w:r>
+        <w:t xml:space="preserve">against Card’s unconverted 6 percent, the federal figures suggest a</w:t>
+      </w:r>
+      <w:r>
+        <w:t xml:space="preserve"> </w:t>
+      </w:r>
+      <w:r>
+        <w:t xml:space="preserve">school that stopped considering race. Read against the 14 percent of</w:t>
+      </w:r>
+      <w:r>
+        <w:t xml:space="preserve"> </w:t>
+      </w:r>
+      <w:r>
+        <w:t xml:space="preserve">the litigation era, itself computed under a third convention, the</w:t>
+      </w:r>
+      <w:r>
+        <w:t xml:space="preserve"> </w:t>
+      </w:r>
+      <w:r>
+        <w:t xml:space="preserve">university’s announcements suggest a school whose Black enrollment</w:t>
+      </w:r>
+      <w:r>
+        <w:t xml:space="preserve"> </w:t>
+      </w:r>
+      <w:r>
+        <w:t xml:space="preserve">changed only modestly, and the exact agreement of the fall 2024</w:t>
+      </w:r>
+      <w:r>
+        <w:t xml:space="preserve"> </w:t>
+      </w:r>
+      <w:r>
+        <w:t xml:space="preserve">announcement with that figure is an accident of the differing</w:t>
+      </w:r>
+      <w:r>
+        <w:t xml:space="preserve"> </w:t>
+      </w:r>
+      <w:r>
+        <w:t xml:space="preserve">metrics. Without a stated</w:t>
+      </w:r>
+      <w:r>
+        <w:t xml:space="preserve"> </w:t>
+      </w:r>
+      <w:r>
+        <w:t xml:space="preserve">conversion between the conventions, neither story can be checked</w:t>
+      </w:r>
+      <w:r>
+        <w:t xml:space="preserve"> </w:t>
+      </w:r>
+      <w:r>
+        <w:t xml:space="preserve">against the other, and enrollment outcomes cannot be monitored by</w:t>
+      </w:r>
+      <w:r>
+        <w:t xml:space="preserve"> </w:t>
+      </w:r>
+      <w:r>
+        <w:t xml:space="preserve">inspection.</w:t>
       </w:r>
     </w:p>
     <w:bookmarkEnd w:id="15"/>
@@ -3224,7 +3933,7 @@
               <w:pStyle w:val="ImageCaption"/>
             </w:pPr>
             <w:r>
-              <w:t xml:space="preserve">Table 2: Black share of first-year US students at the fifteen research universities that filed the Universities Brief, ordered by proportional change. The pre-period comprises the entering classes of fall 2010-2015. The post-period averages fall 2024 and fall 2025 where both filings exist. Changes are computed on unrounded shares and may differ slightly from values recomputed from the rounded shares shown.</w:t>
+              <w:t xml:space="preserve">Table 2: Black share of first-year US students at the fifteen research universities that filed the Universities Brief, ordered by proportional change. The pre-period comprises the entering classes of fall 2010-2015. The post-period averages fall 2024 and fall 2025, or reflects fall 2024 alone where no usable 2025-26 filing exists. Changes are computed on unrounded shares and may differ slightly from values recomputed from the rounded shares shown.</w:t>
             </w:r>
           </w:p>
           <w:tbl>
@@ -4195,25 +4904,55 @@
         <w:t xml:space="preserve"> </w:t>
       </w:r>
       <w:r>
+        <w:t xml:space="preserve">Against the elevated classes of fall 2020 through 2023 the group</w:t>
+      </w:r>
+      <w:r>
+        <w:t xml:space="preserve"> </w:t>
+      </w:r>
+      <w:r>
+        <w:t xml:space="preserve">mean was</w:t>
+      </w:r>
+      <w:r>
+        <w:t xml:space="preserve"> </w:t>
+      </w:r>
+      <w:r>
+        <w:t xml:space="preserve">9.2</w:t>
+      </w:r>
+      <w:r>
+        <w:t xml:space="preserve"> </w:t>
+      </w:r>
+      <w:r>
+        <w:t xml:space="preserve">percent, so the post-ruling level also sits below that later</w:t>
+      </w:r>
+      <w:r>
+        <w:t xml:space="preserve"> </w:t>
+      </w:r>
+      <w:r>
+        <w:t xml:space="preserve">baseline, by roughly</w:t>
+      </w:r>
+      <w:r>
+        <w:t xml:space="preserve"> </w:t>
+      </w:r>
+      <w:r>
+        <w:t xml:space="preserve">22</w:t>
+      </w:r>
+      <w:r>
+        <w:t xml:space="preserve"> </w:t>
+      </w:r>
+      <w:r>
+        <w:t xml:space="preserve">percent.</w:t>
+      </w:r>
+      <w:r>
+        <w:t xml:space="preserve"> </w:t>
+      </w:r>
+      <w:r>
         <w:t xml:space="preserve">Six of the fifteen enroll a higher Black</w:t>
       </w:r>
       <w:r>
         <w:t xml:space="preserve"> </w:t>
       </w:r>
       <w:r>
-        <w:t xml:space="preserve">share than in the pre-period. No signatory sits at half its baseline, and</w:t>
-      </w:r>
-      <w:r>
-        <w:t xml:space="preserve"> </w:t>
-      </w:r>
-      <w:r>
-        <w:t xml:space="preserve">a single one, Carnegie Mellon, shows a decline exceeding even the 33</w:t>
-      </w:r>
-      <w:r>
-        <w:t xml:space="preserve"> </w:t>
-      </w:r>
-      <w:r>
-        <w:t xml:space="preserve">percent figure the brief quoted for a milder counterfactual at Harvard.</w:t>
+        <w:t xml:space="preserve">share than in the pre-period. No signatory sits at half its baseline.</w:t>
       </w:r>
       <w:r>
         <w:t xml:space="preserve"> </w:t>
@@ -4249,19 +4988,7 @@
         <w:t xml:space="preserve"> </w:t>
       </w:r>
       <w:r>
-        <w:t xml:space="preserve">than they did in the pre-period. If the signatories complied with the</w:t>
-      </w:r>
-      <w:r>
-        <w:t xml:space="preserve"> </w:t>
-      </w:r>
-      <w:r>
-        <w:t xml:space="preserve">ruling, their own filings refute their claim that compliance would</w:t>
-      </w:r>
-      <w:r>
-        <w:t xml:space="preserve"> </w:t>
-      </w:r>
-      <w:r>
-        <w:t xml:space="preserve">visibly reduce their racial diversity.</w:t>
+        <w:t xml:space="preserve">than they did in the pre-period.</w:t>
       </w:r>
     </w:p>
     <w:bookmarkEnd w:id="18"/>
@@ -6364,19 +7091,61 @@
         <w:t xml:space="preserve"> </w:t>
       </w:r>
       <w:r>
-        <w:t xml:space="preserve">positive. The group mean did not fall at all, let alone by half, so the</w:t>
-      </w:r>
-      <w:r>
-        <w:t xml:space="preserve"> </w:t>
-      </w:r>
-      <w:r>
-        <w:t xml:space="preserve">forecast fails at the level of the group before any school-level</w:t>
-      </w:r>
-      <w:r>
-        <w:t xml:space="preserve"> </w:t>
-      </w:r>
-      <w:r>
-        <w:t xml:space="preserve">accounting. Because some</w:t>
+        <w:t xml:space="preserve">positive. Relative to the entering classes of 2020 through 2023, the</w:t>
+      </w:r>
+      <w:r>
+        <w:t xml:space="preserve"> </w:t>
+      </w:r>
+      <w:r>
+        <w:t xml:space="preserve">final cohorts admitted under racial preferences, the post-ruling mean</w:t>
+      </w:r>
+      <w:r>
+        <w:t xml:space="preserve"> </w:t>
+      </w:r>
+      <w:r>
+        <w:t xml:space="preserve">is about</w:t>
+      </w:r>
+      <w:r>
+        <w:t xml:space="preserve"> </w:t>
+      </w:r>
+      <w:r>
+        <w:t xml:space="preserve">10</w:t>
+      </w:r>
+      <w:r>
+        <w:t xml:space="preserve"> </w:t>
+      </w:r>
+      <w:r>
+        <w:t xml:space="preserve">percent lower, a comparison in harmony with the declines reported by</w:t>
+      </w:r>
+      <w:r>
+        <w:t xml:space="preserve"> </w:t>
+      </w:r>
+      <w:r>
+        <w:t xml:space="preserve">Snider (2026) and Murphy (2026). The group mean did not fall at all</w:t>
+      </w:r>
+      <w:r>
+        <w:t xml:space="preserve"> </w:t>
+      </w:r>
+      <w:r>
+        <w:t xml:space="preserve">against the litigation baseline, and fell by about a tenth against</w:t>
+      </w:r>
+      <w:r>
+        <w:t xml:space="preserve"> </w:t>
+      </w:r>
+      <w:r>
+        <w:t xml:space="preserve">the later one. Either way it did not fall by half, so the forecast</w:t>
+      </w:r>
+      <w:r>
+        <w:t xml:space="preserve"> </w:t>
+      </w:r>
+      <w:r>
+        <w:t xml:space="preserve">fails at the level of the group before any school-level accounting.</w:t>
+      </w:r>
+      <w:r>
+        <w:t xml:space="preserve"> </w:t>
+      </w:r>
+      <w:r>
+        <w:t xml:space="preserve">Because some</w:t>
       </w:r>
       <w:r>
         <w:t xml:space="preserve"> </w:t>
@@ -6406,13 +7175,13 @@
         <w:t xml:space="preserve"> </w:t>
       </w:r>
       <w:r>
-        <w:t xml:space="preserve">5.1%,</w:t>
-      </w:r>
-      <w:r>
-        <w:t xml:space="preserve"> </w:t>
-      </w:r>
-      <w:r>
-        <w:t xml:space="preserve">similar to the full-group figure.</w:t>
+        <w:t xml:space="preserve">5.1</w:t>
+      </w:r>
+      <w:r>
+        <w:t xml:space="preserve"> </w:t>
+      </w:r>
+      <w:r>
+        <w:t xml:space="preserve">percent, similar to the full-group figure.</w:t>
       </w:r>
     </w:p>
     <w:p>
@@ -6741,19 +7510,19 @@
         <w:t xml:space="preserve"> </w:t>
       </w:r>
       <w:r>
-        <w:t xml:space="preserve">the center of the long-run band is under one percentage point, a fifth or</w:t>
-      </w:r>
-      <w:r>
-        <w:t xml:space="preserve"> </w:t>
-      </w:r>
-      <w:r>
-        <w:t xml:space="preserve">less of the three-and-a-half to five points that declines of 50 to 70</w:t>
-      </w:r>
-      <w:r>
-        <w:t xml:space="preserve"> </w:t>
-      </w:r>
-      <w:r>
-        <w:t xml:space="preserve">percent imply on a base near 7 percent. Selection into fall 2025</w:t>
+        <w:t xml:space="preserve">the center of the long-run band is roughly one percentage point, between</w:t>
+      </w:r>
+      <w:r>
+        <w:t xml:space="preserve"> </w:t>
+      </w:r>
+      <w:r>
+        <w:t xml:space="preserve">a fifth and a third of the three-and-a-half to five points that declines</w:t>
+      </w:r>
+      <w:r>
+        <w:t xml:space="preserve"> </w:t>
+      </w:r>
+      <w:r>
+        <w:t xml:space="preserve">of 50 to 70 percent imply on a base near 7 percent. Selection into fall 2025</w:t>
       </w:r>
       <w:r>
         <w:t xml:space="preserve"> </w:t>
@@ -6851,19 +7620,25 @@
         <w:t xml:space="preserve"> </w:t>
       </w:r>
       <w:r>
-        <w:t xml:space="preserve">enrollment by large amounts within one to two cycles. The relevant</w:t>
-      </w:r>
-      <w:r>
-        <w:t xml:space="preserve"> </w:t>
-      </w:r>
-      <w:r>
-        <w:t xml:space="preserve">question for the post-ruling period is whether that capacity was</w:t>
-      </w:r>
-      <w:r>
-        <w:t xml:space="preserve"> </w:t>
-      </w:r>
-      <w:r>
-        <w:t xml:space="preserve">surrendered or redirected.</w:t>
+        <w:t xml:space="preserve">enrollment by large amounts within one to two cycles. That capacity</w:t>
+      </w:r>
+      <w:r>
+        <w:t xml:space="preserve"> </w:t>
+      </w:r>
+      <w:r>
+        <w:t xml:space="preserve">did not vanish in June 2023. The question the post-ruling filings</w:t>
+      </w:r>
+      <w:r>
+        <w:t xml:space="preserve"> </w:t>
+      </w:r>
+      <w:r>
+        <w:t xml:space="preserve">pose is whether the schools stopped using it or are using it still,</w:t>
+      </w:r>
+      <w:r>
+        <w:t xml:space="preserve"> </w:t>
+      </w:r>
+      <w:r>
+        <w:t xml:space="preserve">now to hold Black enrollment steady rather than to raise it.</w:t>
       </w:r>
     </w:p>
     <w:p>
@@ -7688,13 +8463,25 @@
         <w:t xml:space="preserve">SFFA v. Harvard</w:t>
       </w:r>
       <w:r>
-        <w:t xml:space="preserve">, the enrollment records of</w:t>
-      </w:r>
-      <w:r>
-        <w:t xml:space="preserve"> </w:t>
-      </w:r>
-      <w:r>
-        <w:t xml:space="preserve">the institutions most affected by the decision show the following:</w:t>
+        <w:t xml:space="preserve">, the enrollment</w:t>
+      </w:r>
+      <w:r>
+        <w:t xml:space="preserve"> </w:t>
+      </w:r>
+      <w:r>
+        <w:t xml:space="preserve">records of the institutions most affected by the decision, measured</w:t>
+      </w:r>
+      <w:r>
+        <w:t xml:space="preserve"> </w:t>
+      </w:r>
+      <w:r>
+        <w:t xml:space="preserve">against the litigation-era entering classes of fall 2010 through</w:t>
+      </w:r>
+      <w:r>
+        <w:t xml:space="preserve"> </w:t>
+      </w:r>
+      <w:r>
+        <w:t xml:space="preserve">2015, except where stated, show the following:</w:t>
       </w:r>
     </w:p>
     <w:p>
@@ -7781,13 +8568,19 @@
         <w:t xml:space="preserve"> </w:t>
       </w:r>
       <w:r>
-        <w:t xml:space="preserve">objections, moved from roughly 2.6 to roughly 3.1 against race-blind</w:t>
-      </w:r>
-      <w:r>
-        <w:t xml:space="preserve"> </w:t>
-      </w:r>
-      <w:r>
-        <w:t xml:space="preserve">benchmarks two to eight times higher.</w:t>
+        <w:t xml:space="preserve">objections, moved from 2.6 on the eve of the ruling to 3.1, a</w:t>
+      </w:r>
+      <w:r>
+        <w:t xml:space="preserve"> </w:t>
+      </w:r>
+      <w:r>
+        <w:t xml:space="preserve">fraction of the distance to race-blind benchmarks two to eight</w:t>
+      </w:r>
+      <w:r>
+        <w:t xml:space="preserve"> </w:t>
+      </w:r>
+      <w:r>
+        <w:t xml:space="preserve">times higher.</w:t>
       </w:r>
     </w:p>
     <w:p>
@@ -7818,49 +8611,49 @@
         <w:pStyle w:val="FirstParagraph"/>
       </w:pPr>
       <w:r>
-        <w:t xml:space="preserve">The parsimonious reading of this</w:t>
-      </w:r>
-      <w:r>
-        <w:t xml:space="preserve"> </w:t>
-      </w:r>
-      <w:r>
-        <w:t xml:space="preserve">evidence is that elite institutions have not meaningfully changed the</w:t>
-      </w:r>
-      <w:r>
-        <w:t xml:space="preserve"> </w:t>
-      </w:r>
-      <w:r>
-        <w:t xml:space="preserve">admissions policies the ruling was intended to end. That characterization is an</w:t>
-      </w:r>
-      <w:r>
-        <w:t xml:space="preserve"> </w:t>
-      </w:r>
-      <w:r>
-        <w:t xml:space="preserve">interpretation of the pattern, not a finding the data compel. The data</w:t>
-      </w:r>
-      <w:r>
-        <w:t xml:space="preserve"> </w:t>
-      </w:r>
-      <w:r>
-        <w:t xml:space="preserve">cannot identify the mechanism. Whether present practice reflects</w:t>
-      </w:r>
-      <w:r>
-        <w:t xml:space="preserve"> </w:t>
-      </w:r>
-      <w:r>
-        <w:t xml:space="preserve">consideration of race as such, which the Court prohibited, or of</w:t>
-      </w:r>
-      <w:r>
-        <w:t xml:space="preserve"> </w:t>
-      </w:r>
-      <w:r>
-        <w:t xml:space="preserve">experiential factors correlated with race, which the Court permitted, is</w:t>
-      </w:r>
-      <w:r>
-        <w:t xml:space="preserve"> </w:t>
-      </w:r>
-      <w:r>
-        <w:t xml:space="preserve">not answerable from aggregate filings, and I do not claim otherwise.</w:t>
+        <w:t xml:space="preserve">Measured instead against the elevated classes of fall 2020 through</w:t>
+      </w:r>
+      <w:r>
+        <w:t xml:space="preserve"> </w:t>
+      </w:r>
+      <w:r>
+        <w:t xml:space="preserve">2023, a period akin to the more recent baselines used by Snider</w:t>
+      </w:r>
+      <w:r>
+        <w:t xml:space="preserve"> </w:t>
+      </w:r>
+      <w:r>
+        <w:t xml:space="preserve">(2026), Murphy (2026), and Bloem et al. (2026), Black enrollment at</w:t>
+      </w:r>
+      <w:r>
+        <w:t xml:space="preserve"> </w:t>
+      </w:r>
+      <w:r>
+        <w:t xml:space="preserve">these institutions is lower, by about a tenth at the amici colleges,</w:t>
+      </w:r>
+      <w:r>
+        <w:t xml:space="preserve"> </w:t>
+      </w:r>
+      <w:r>
+        <w:t xml:space="preserve">roughly a fifth at the research universities, and larger margins at</w:t>
+      </w:r>
+      <w:r>
+        <w:t xml:space="preserve"> </w:t>
+      </w:r>
+      <w:r>
+        <w:t xml:space="preserve">some individual campuses. That decline is</w:t>
+      </w:r>
+      <w:r>
+        <w:t xml:space="preserve"> </w:t>
+      </w:r>
+      <w:r>
+        <w:t xml:space="preserve">real. It is also a fraction of the 50 to 70 percent the</w:t>
+      </w:r>
+      <w:r>
+        <w:t xml:space="preserve"> </w:t>
+      </w:r>
+      <w:r>
+        <w:t xml:space="preserve">institutions forecast, under any baseline on offer.</w:t>
       </w:r>
     </w:p>
     <w:p>
@@ -7868,55 +8661,115 @@
         <w:pStyle w:val="BodyText"/>
       </w:pPr>
       <w:r>
-        <w:t xml:space="preserve">What</w:t>
-      </w:r>
-      <w:r>
-        <w:t xml:space="preserve"> </w:t>
-      </w:r>
-      <w:r>
-        <w:t xml:space="preserve">the analysis does establish is that the quantitative expertise deployed in</w:t>
-      </w:r>
-      <w:r>
-        <w:t xml:space="preserve"> </w:t>
-      </w:r>
-      <w:r>
-        <w:t xml:space="preserve">the litigation has functioned, after the fact, to obscure the question. The most cited prediction in the case was stated</w:t>
-      </w:r>
-      <w:r>
-        <w:t xml:space="preserve"> </w:t>
-      </w:r>
-      <w:r>
-        <w:t xml:space="preserve">in units that no public statistic reports, by an expert whose analysis</w:t>
-      </w:r>
-      <w:r>
-        <w:t xml:space="preserve"> </w:t>
-      </w:r>
-      <w:r>
-        <w:t xml:space="preserve">never faced peer review but was certified as sound to the Supreme Court</w:t>
-      </w:r>
-      <w:r>
-        <w:t xml:space="preserve"> </w:t>
-      </w:r>
-      <w:r>
-        <w:t xml:space="preserve">by sixteen economists including three Nobel laureates, and any</w:t>
-      </w:r>
-      <w:r>
-        <w:t xml:space="preserve"> </w:t>
-      </w:r>
-      <w:r>
-        <w:t xml:space="preserve">comparison of it against filings</w:t>
-      </w:r>
-      <w:r>
-        <w:t xml:space="preserve"> </w:t>
-      </w:r>
-      <w:r>
-        <w:t xml:space="preserve">computed under incompatible definitions generates an appearance of</w:t>
-      </w:r>
-      <w:r>
-        <w:t xml:space="preserve"> </w:t>
-      </w:r>
-      <w:r>
-        <w:t xml:space="preserve">compliance that a factor-of-two conversion dissolves.</w:t>
+        <w:t xml:space="preserve">The parsimonious reading of this evidence is that elite institutions</w:t>
+      </w:r>
+      <w:r>
+        <w:t xml:space="preserve"> </w:t>
+      </w:r>
+      <w:r>
+        <w:t xml:space="preserve">have not meaningfully changed the admissions policies the ruling was</w:t>
+      </w:r>
+      <w:r>
+        <w:t xml:space="preserve"> </w:t>
+      </w:r>
+      <w:r>
+        <w:t xml:space="preserve">intended to end. That characterization is an interpretation of the</w:t>
+      </w:r>
+      <w:r>
+        <w:t xml:space="preserve"> </w:t>
+      </w:r>
+      <w:r>
+        <w:t xml:space="preserve">pattern, not a finding the data compel. Two explanations could in</w:t>
+      </w:r>
+      <w:r>
+        <w:t xml:space="preserve"> </w:t>
+      </w:r>
+      <w:r>
+        <w:t xml:space="preserve">principle produce the observed stability. Institutions may have</w:t>
+      </w:r>
+      <w:r>
+        <w:t xml:space="preserve"> </w:t>
+      </w:r>
+      <w:r>
+        <w:t xml:space="preserve">adopted new race-neutral recruiting methods that happened to</w:t>
+      </w:r>
+      <w:r>
+        <w:t xml:space="preserve"> </w:t>
+      </w:r>
+      <w:r>
+        <w:t xml:space="preserve">reproduce, almost exactly, the racial composition their</w:t>
+      </w:r>
+      <w:r>
+        <w:t xml:space="preserve"> </w:t>
+      </w:r>
+      <w:r>
+        <w:t xml:space="preserve">race-conscious methods produced. Or institutions may have continued</w:t>
+      </w:r>
+      <w:r>
+        <w:t xml:space="preserve"> </w:t>
+      </w:r>
+      <w:r>
+        <w:t xml:space="preserve">to consider race in some form. The first requires a coincidence.</w:t>
+      </w:r>
+      <w:r>
+        <w:t xml:space="preserve"> </w:t>
+      </w:r>
+      <w:r>
+        <w:t xml:space="preserve">Race-neutral tools such as rural or first-generation outreach might</w:t>
+      </w:r>
+      <w:r>
+        <w:t xml:space="preserve"> </w:t>
+      </w:r>
+      <w:r>
+        <w:t xml:space="preserve">affect the admissions chances of students of every race, and</w:t>
+      </w:r>
+      <w:r>
+        <w:t xml:space="preserve"> </w:t>
+      </w:r>
+      <w:r>
+        <w:t xml:space="preserve">nothing about them returns a school to its precise pre-ruling</w:t>
+      </w:r>
+      <w:r>
+        <w:t xml:space="preserve"> </w:t>
+      </w:r>
+      <w:r>
+        <w:t xml:space="preserve">racial shares, while aiming them at particular racial groups in</w:t>
+      </w:r>
+      <w:r>
+        <w:t xml:space="preserve"> </w:t>
+      </w:r>
+      <w:r>
+        <w:t xml:space="preserve">order to achieve that return would itself be a form of racial</w:t>
+      </w:r>
+      <w:r>
+        <w:t xml:space="preserve"> </w:t>
+      </w:r>
+      <w:r>
+        <w:t xml:space="preserve">consideration. The second requires no coincidence. The data cannot</w:t>
+      </w:r>
+      <w:r>
+        <w:t xml:space="preserve"> </w:t>
+      </w:r>
+      <w:r>
+        <w:t xml:space="preserve">adjudicate between these explanations. Whether present practice</w:t>
+      </w:r>
+      <w:r>
+        <w:t xml:space="preserve"> </w:t>
+      </w:r>
+      <w:r>
+        <w:t xml:space="preserve">reflects consideration of race as such, which the Court prohibited,</w:t>
+      </w:r>
+      <w:r>
+        <w:t xml:space="preserve"> </w:t>
+      </w:r>
+      <w:r>
+        <w:t xml:space="preserve">or of experiential factors correlated with race, which the Court</w:t>
+      </w:r>
+      <w:r>
+        <w:t xml:space="preserve"> </w:t>
+      </w:r>
+      <w:r>
+        <w:t xml:space="preserve">permitted, is not answerable from aggregate filings.</w:t>
       </w:r>
     </w:p>
     <w:p>
@@ -7924,37 +8777,69 @@
         <w:pStyle w:val="BodyText"/>
       </w:pPr>
       <w:r>
-        <w:t xml:space="preserve">Economists who</w:t>
-      </w:r>
-      <w:r>
-        <w:t xml:space="preserve"> </w:t>
-      </w:r>
-      <w:r>
-        <w:t xml:space="preserve">supply litigation estimates in nonpublic units might reasonably be</w:t>
-      </w:r>
-      <w:r>
-        <w:t xml:space="preserve"> </w:t>
-      </w:r>
-      <w:r>
-        <w:t xml:space="preserve">expected to publish the mapping to public categories at the same time.</w:t>
-      </w:r>
-      <w:r>
-        <w:t xml:space="preserve"> </w:t>
-      </w:r>
-      <w:r>
-        <w:t xml:space="preserve">Absent such mappings, predictions of this kind are unfalsifiable in</w:t>
-      </w:r>
-      <w:r>
-        <w:t xml:space="preserve"> </w:t>
-      </w:r>
-      <w:r>
-        <w:t xml:space="preserve">practice, whatever their merits in principle, and the institutions they</w:t>
-      </w:r>
-      <w:r>
-        <w:t xml:space="preserve"> </w:t>
-      </w:r>
-      <w:r>
-        <w:t xml:space="preserve">concern are the primary beneficiaries of the ambiguity.</w:t>
+        <w:t xml:space="preserve">What the analysis does establish is that the quantitative expertise</w:t>
+      </w:r>
+      <w:r>
+        <w:t xml:space="preserve"> </w:t>
+      </w:r>
+      <w:r>
+        <w:t xml:space="preserve">deployed in the litigation has functioned, after the fact, to</w:t>
+      </w:r>
+      <w:r>
+        <w:t xml:space="preserve"> </w:t>
+      </w:r>
+      <w:r>
+        <w:t xml:space="preserve">obscure the question. The most important prediction in the case was</w:t>
+      </w:r>
+      <w:r>
+        <w:t xml:space="preserve"> </w:t>
+      </w:r>
+      <w:r>
+        <w:t xml:space="preserve">stated in units that no public statistic reports, and any comparison</w:t>
+      </w:r>
+      <w:r>
+        <w:t xml:space="preserve"> </w:t>
+      </w:r>
+      <w:r>
+        <w:t xml:space="preserve">of it against filings computed under incompatible definitions</w:t>
+      </w:r>
+      <w:r>
+        <w:t xml:space="preserve"> </w:t>
+      </w:r>
+      <w:r>
+        <w:t xml:space="preserve">generates an appearance of compliance that a factor-of-two</w:t>
+      </w:r>
+      <w:r>
+        <w:t xml:space="preserve"> </w:t>
+      </w:r>
+      <w:r>
+        <w:t xml:space="preserve">conversion dissolves.</w:t>
+      </w:r>
+    </w:p>
+    <w:p>
+      <w:pPr>
+        <w:pStyle w:val="BodyText"/>
+      </w:pPr>
+      <w:r>
+        <w:t xml:space="preserve">Economists who supply litigation estimates in nonpublic units might</w:t>
+      </w:r>
+      <w:r>
+        <w:t xml:space="preserve"> </w:t>
+      </w:r>
+      <w:r>
+        <w:t xml:space="preserve">reasonably be expected to publish the mapping to public categories</w:t>
+      </w:r>
+      <w:r>
+        <w:t xml:space="preserve"> </w:t>
+      </w:r>
+      <w:r>
+        <w:t xml:space="preserve">at the same time. Absent such mappings, predictions of this kind are</w:t>
+      </w:r>
+      <w:r>
+        <w:t xml:space="preserve"> </w:t>
+      </w:r>
+      <w:r>
+        <w:t xml:space="preserve">unfalsifiable in practice, whatever their merits in principle.</w:t>
       </w:r>
     </w:p>
     <w:bookmarkEnd w:id="33"/>
@@ -8008,7 +8893,7 @@
       </w:r>
     </w:p>
     <w:bookmarkEnd w:id="35"/>
-    <w:bookmarkStart w:id="63" w:name="references"/>
+    <w:bookmarkStart w:id="65" w:name="references"/>
     <w:p>
       <w:pPr>
         <w:pStyle w:val="Heading2"/>
@@ -9165,70 +10050,19 @@
         <w:pStyle w:val="BodyText"/>
       </w:pPr>
       <w:r>
-        <w:t xml:space="preserve">Universities Brief. 2022. Brief of Brown University, California Institute</w:t>
-      </w:r>
-      <w:r>
-        <w:t xml:space="preserve"> </w:t>
-      </w:r>
-      <w:r>
-        <w:t xml:space="preserve">of Technology, Carnegie Mellon University, Columbia University, Cornell</w:t>
-      </w:r>
-      <w:r>
-        <w:t xml:space="preserve"> </w:t>
-      </w:r>
-      <w:r>
-        <w:t xml:space="preserve">University, Dartmouth College, Duke University, Emory University, Johns</w:t>
-      </w:r>
-      <w:r>
-        <w:t xml:space="preserve"> </w:t>
-      </w:r>
-      <w:r>
-        <w:t xml:space="preserve">Hopkins University, Princeton University, University of Chicago,</w:t>
-      </w:r>
-      <w:r>
-        <w:t xml:space="preserve"> </w:t>
-      </w:r>
-      <w:r>
-        <w:t xml:space="preserve">University of Pennsylvania, Vanderbilt University, Washington University</w:t>
-      </w:r>
-      <w:r>
-        <w:t xml:space="preserve"> </w:t>
-      </w:r>
-      <w:r>
-        <w:t xml:space="preserve">in St. Louis, and Yale University as Amici Curiae,</w:t>
-      </w:r>
-      <w:r>
-        <w:t xml:space="preserve"> </w:t>
-      </w:r>
-      <w:r>
-        <w:rPr>
-          <w:i/>
-          <w:iCs/>
-        </w:rPr>
-        <w:t xml:space="preserve">Students for Fair</w:t>
-      </w:r>
-      <w:r>
-        <w:rPr>
-          <w:i/>
-          <w:iCs/>
-        </w:rPr>
-        <w:t xml:space="preserve"> </w:t>
-      </w:r>
-      <w:r>
-        <w:rPr>
-          <w:i/>
-          <w:iCs/>
-        </w:rPr>
-        <w:t xml:space="preserve">Admissions v. Harvard</w:t>
-      </w:r>
-      <w:r>
-        <w:t xml:space="preserve">, Nos. 20-1199 and 21-707 (U.S. Supreme Court,</w:t>
-      </w:r>
-      <w:r>
-        <w:t xml:space="preserve"> </w:t>
-      </w:r>
-      <w:r>
-        <w:t xml:space="preserve">August 1).</w:t>
+        <w:t xml:space="preserve">Murphy, James S. 2026. The Future of Fair Admissions: A First Look</w:t>
+      </w:r>
+      <w:r>
+        <w:t xml:space="preserve"> </w:t>
+      </w:r>
+      <w:r>
+        <w:t xml:space="preserve">at College Enrollment Outcomes After the End of Affirmative Action.</w:t>
+      </w:r>
+      <w:r>
+        <w:t xml:space="preserve"> </w:t>
+      </w:r>
+      <w:r>
+        <w:t xml:space="preserve">Class Action (January).</w:t>
       </w:r>
       <w:r>
         <w:t xml:space="preserve"> </w:t>
@@ -9242,8 +10076,127 @@
         </w:r>
       </w:hyperlink>
     </w:p>
-    <w:bookmarkEnd w:id="63"/>
-    <w:bookmarkStart w:id="64" w:name="cases-cited"/>
+    <w:p>
+      <w:pPr>
+        <w:pStyle w:val="BodyText"/>
+      </w:pPr>
+      <w:r>
+        <w:t xml:space="preserve">Snider, Emily. 2026. The Impact of the 2023 Students for Fair</w:t>
+      </w:r>
+      <w:r>
+        <w:t xml:space="preserve"> </w:t>
+      </w:r>
+      <w:r>
+        <w:t xml:space="preserve">Admissions v Harvard Decision on Undergraduate Demographics.</w:t>
+      </w:r>
+      <w:r>
+        <w:t xml:space="preserve"> </w:t>
+      </w:r>
+      <w:r>
+        <w:t xml:space="preserve">EdWorkingPaper 26-1471, Annenberg Institute, Brown University</w:t>
+      </w:r>
+      <w:r>
+        <w:t xml:space="preserve"> </w:t>
+      </w:r>
+      <w:r>
+        <w:t xml:space="preserve">(May).</w:t>
+      </w:r>
+      <w:r>
+        <w:t xml:space="preserve"> </w:t>
+      </w:r>
+      <w:hyperlink r:id="rId63">
+        <w:r>
+          <w:rPr>
+            <w:rStyle w:val="Hyperlink"/>
+          </w:rPr>
+          <w:t xml:space="preserve">Link</w:t>
+        </w:r>
+      </w:hyperlink>
+    </w:p>
+    <w:p>
+      <w:pPr>
+        <w:pStyle w:val="BodyText"/>
+      </w:pPr>
+      <w:r>
+        <w:t xml:space="preserve">Universities Brief. 2022. Brief of Brown University, California Institute</w:t>
+      </w:r>
+      <w:r>
+        <w:t xml:space="preserve"> </w:t>
+      </w:r>
+      <w:r>
+        <w:t xml:space="preserve">of Technology, Carnegie Mellon University, Columbia University, Cornell</w:t>
+      </w:r>
+      <w:r>
+        <w:t xml:space="preserve"> </w:t>
+      </w:r>
+      <w:r>
+        <w:t xml:space="preserve">University, Dartmouth College, Duke University, Emory University, Johns</w:t>
+      </w:r>
+      <w:r>
+        <w:t xml:space="preserve"> </w:t>
+      </w:r>
+      <w:r>
+        <w:t xml:space="preserve">Hopkins University, Princeton University, University of Chicago,</w:t>
+      </w:r>
+      <w:r>
+        <w:t xml:space="preserve"> </w:t>
+      </w:r>
+      <w:r>
+        <w:t xml:space="preserve">University of Pennsylvania, Vanderbilt University, Washington University</w:t>
+      </w:r>
+      <w:r>
+        <w:t xml:space="preserve"> </w:t>
+      </w:r>
+      <w:r>
+        <w:t xml:space="preserve">in St. Louis, and Yale University as Amici Curiae,</w:t>
+      </w:r>
+      <w:r>
+        <w:t xml:space="preserve"> </w:t>
+      </w:r>
+      <w:r>
+        <w:rPr>
+          <w:i/>
+          <w:iCs/>
+        </w:rPr>
+        <w:t xml:space="preserve">Students for Fair</w:t>
+      </w:r>
+      <w:r>
+        <w:rPr>
+          <w:i/>
+          <w:iCs/>
+        </w:rPr>
+        <w:t xml:space="preserve"> </w:t>
+      </w:r>
+      <w:r>
+        <w:rPr>
+          <w:i/>
+          <w:iCs/>
+        </w:rPr>
+        <w:t xml:space="preserve">Admissions v. Harvard</w:t>
+      </w:r>
+      <w:r>
+        <w:t xml:space="preserve">, Nos. 20-1199 and 21-707 (U.S. Supreme Court,</w:t>
+      </w:r>
+      <w:r>
+        <w:t xml:space="preserve"> </w:t>
+      </w:r>
+      <w:r>
+        <w:t xml:space="preserve">August 1).</w:t>
+      </w:r>
+      <w:r>
+        <w:t xml:space="preserve"> </w:t>
+      </w:r>
+      <w:hyperlink r:id="rId64">
+        <w:r>
+          <w:rPr>
+            <w:rStyle w:val="Hyperlink"/>
+          </w:rPr>
+          <w:t xml:space="preserve">Link</w:t>
+        </w:r>
+      </w:hyperlink>
+    </w:p>
+    <w:bookmarkEnd w:id="65"/>
+    <w:bookmarkStart w:id="66" w:name="cases-cited"/>
     <w:p>
       <w:pPr>
         <w:pStyle w:val="Heading2"/>
@@ -9325,8 +10278,8 @@
         <w:t xml:space="preserve">, 600 U.S. 181 (2023).</w:t>
       </w:r>
     </w:p>
-    <w:bookmarkEnd w:id="64"/>
-    <w:bookmarkStart w:id="65" w:name="about-the-author"/>
+    <w:bookmarkEnd w:id="66"/>
+    <w:bookmarkStart w:id="67" w:name="about-the-author"/>
     <w:p>
       <w:pPr>
         <w:pStyle w:val="Heading2"/>
@@ -9385,7 +10338,7 @@
         <w:t xml:space="preserve">is dave.kane@gmail.com.</w:t>
       </w:r>
     </w:p>
-    <w:bookmarkEnd w:id="65"/>
+    <w:bookmarkEnd w:id="67"/>
     <w:sectPr>
       <w:footnotePr>
         <w:numRestart w:val="eachSect"/>

</xml_diff>